<commit_message>
Posts: 3 per week (Mon/Wed/Fri), remove lesson numbers and captions
Co-Authored-By: Claude Opus 5.5 <noreply@anthropic.com>
Claude-Session: https://claude.ai/code/session_01FgjxzsDdzzGnQ6pRqhP9ux
</commit_message>
<xml_diff>
--- a/Посты_для_канала_32.docx
+++ b/Посты_для_канала_32.docx
@@ -159,7 +159,7 @@
           <w:color w:val="6B665E"/>
           <w:sz w:val="20"/>
         </w:rPr>
-        <w:t>Версия от 09.10.2026</w:t>
+        <w:t>Версия от 10.10.2026</w:t>
       </w:r>
     </w:p>
     <w:p>
@@ -210,7 +210,7 @@
           <w:color w:val="1F1D1A"/>
           <w:sz w:val="22"/>
         </w:rPr>
-        <w:t>Два поста в неделю, например во вторник и четверг. Весь курс занимает 16 недель. Если коллеги не успевают, лучше растянуть курс, чем сократить посты.</w:t>
+        <w:t>Три поста в неделю: понедельник, среда и пятница. Весь курс занимает 11 недель, в последнюю неделю выходят два поста — в понедельник и среду. Если коллеги не успевают, лучше растянуть курс, чем сокращать посты.</w:t>
       </w:r>
     </w:p>
     <w:p>
@@ -244,7 +244,7 @@
           <w:color w:val="1F1D1A"/>
           <w:sz w:val="21"/>
         </w:rPr>
-        <w:t>«Урок N. Тема» — чтобы посты было легко искать в канале</w:t>
+        <w:t>короткая и понятная тема — чтобы посты было легко искать в канале</w:t>
       </w:r>
     </w:p>
     <w:p>
@@ -1033,7 +1033,8 @@
       <w:tblGrid>
         <w:gridCol w:w="567"/>
         <w:gridCol w:w="907"/>
-        <w:gridCol w:w="5783"/>
+        <w:gridCol w:w="680"/>
+        <w:gridCol w:w="5102"/>
         <w:gridCol w:w="2268"/>
       </w:tblGrid>
       <w:tr>
@@ -1108,7 +1109,7 @@
         </w:tc>
         <w:tc>
           <w:tcPr>
-            <w:tcW w:type="dxa" w:w="5783"/>
+            <w:tcW w:type="dxa" w:w="680"/>
             <w:shd w:val="clear" w:color="auto" w:fill="1F1D1A"/>
             <w:tcBorders>
               <w:top w:val="single" w:sz="4" w:color="E2DBCF"/>
@@ -1135,13 +1136,13 @@
                 <w:color w:val="FFFFFF"/>
                 <w:sz w:val="19"/>
               </w:rPr>
-              <w:t>Тема</w:t>
-            </w:r>
-          </w:p>
-        </w:tc>
-        <w:tc>
-          <w:tcPr>
-            <w:tcW w:type="dxa" w:w="2268"/>
+              <w:t>День</w:t>
+            </w:r>
+          </w:p>
+        </w:tc>
+        <w:tc>
+          <w:tcPr>
+            <w:tcW w:type="dxa" w:w="5102"/>
             <w:shd w:val="clear" w:color="auto" w:fill="1F1D1A"/>
             <w:tcBorders>
               <w:top w:val="single" w:sz="4" w:color="E2DBCF"/>
@@ -1168,6 +1169,39 @@
                 <w:color w:val="FFFFFF"/>
                 <w:sz w:val="19"/>
               </w:rPr>
+              <w:t>Тема</w:t>
+            </w:r>
+          </w:p>
+        </w:tc>
+        <w:tc>
+          <w:tcPr>
+            <w:tcW w:type="dxa" w:w="2268"/>
+            <w:shd w:val="clear" w:color="auto" w:fill="1F1D1A"/>
+            <w:tcBorders>
+              <w:top w:val="single" w:sz="4" w:color="E2DBCF"/>
+              <w:left w:val="single" w:sz="4" w:color="E2DBCF"/>
+              <w:bottom w:val="single" w:sz="4" w:color="E2DBCF"/>
+              <w:right w:val="single" w:sz="4" w:color="E2DBCF"/>
+            </w:tcBorders>
+            <w:tcMar>
+              <w:top w:w="80" w:type="dxa"/>
+              <w:bottom w:w="80" w:type="dxa"/>
+              <w:start w:w="120" w:type="dxa"/>
+              <w:end w:w="120" w:type="dxa"/>
+            </w:tcMar>
+          </w:tcPr>
+          <w:p>
+            <w:pPr>
+              <w:spacing w:after="0"/>
+            </w:pPr>
+            <w:r>
+              <w:rPr>
+                <w:rFonts w:ascii="Calibri" w:hAnsi="Calibri"/>
+                <w:b/>
+                <w:i w:val="0"/>
+                <w:color w:val="FFFFFF"/>
+                <w:sz w:val="19"/>
+              </w:rPr>
               <w:t>Медиа</w:t>
             </w:r>
           </w:p>
@@ -1240,7 +1274,7 @@
         </w:tc>
         <w:tc>
           <w:tcPr>
-            <w:tcW w:type="dxa" w:w="5783"/>
+            <w:tcW w:type="dxa" w:w="680"/>
             <w:tcBorders>
               <w:top w:val="single" w:sz="4" w:color="E2DBCF"/>
               <w:left w:val="single" w:sz="4" w:color="E2DBCF"/>
@@ -1266,13 +1300,13 @@
                 <w:color w:val="1F1D1A"/>
                 <w:sz w:val="19"/>
               </w:rPr>
-              <w:t>Что такое Claude и чем он не является</w:t>
-            </w:r>
-          </w:p>
-        </w:tc>
-        <w:tc>
-          <w:tcPr>
-            <w:tcW w:type="dxa" w:w="2268"/>
+              <w:t>Пн</w:t>
+            </w:r>
+          </w:p>
+        </w:tc>
+        <w:tc>
+          <w:tcPr>
+            <w:tcW w:type="dxa" w:w="5102"/>
             <w:tcBorders>
               <w:top w:val="single" w:sz="4" w:color="E2DBCF"/>
               <w:left w:val="single" w:sz="4" w:color="E2DBCF"/>
@@ -1298,16 +1332,13 @@
                 <w:color w:val="1F1D1A"/>
                 <w:sz w:val="19"/>
               </w:rPr>
-              <w:t>схема</w:t>
-            </w:r>
-          </w:p>
-        </w:tc>
-      </w:tr>
-      <w:tr>
-        <w:tc>
-          <w:tcPr>
-            <w:tcW w:type="dxa" w:w="567"/>
-            <w:shd w:val="clear" w:color="auto" w:fill="F7F4EF"/>
+              <w:t>Что такое Claude и чем он не является</w:t>
+            </w:r>
+          </w:p>
+        </w:tc>
+        <w:tc>
+          <w:tcPr>
+            <w:tcW w:type="dxa" w:w="2268"/>
             <w:tcBorders>
               <w:top w:val="single" w:sz="4" w:color="E2DBCF"/>
               <w:left w:val="single" w:sz="4" w:color="E2DBCF"/>
@@ -1333,13 +1364,15 @@
                 <w:color w:val="1F1D1A"/>
                 <w:sz w:val="19"/>
               </w:rPr>
-              <w:t>2</w:t>
-            </w:r>
-          </w:p>
-        </w:tc>
-        <w:tc>
-          <w:tcPr>
-            <w:tcW w:type="dxa" w:w="907"/>
+              <w:t>схема</w:t>
+            </w:r>
+          </w:p>
+        </w:tc>
+      </w:tr>
+      <w:tr>
+        <w:tc>
+          <w:tcPr>
+            <w:tcW w:type="dxa" w:w="567"/>
             <w:shd w:val="clear" w:color="auto" w:fill="F7F4EF"/>
             <w:tcBorders>
               <w:top w:val="single" w:sz="4" w:color="E2DBCF"/>
@@ -1366,13 +1399,13 @@
                 <w:color w:val="1F1D1A"/>
                 <w:sz w:val="19"/>
               </w:rPr>
-              <w:t>1</w:t>
-            </w:r>
-          </w:p>
-        </w:tc>
-        <w:tc>
-          <w:tcPr>
-            <w:tcW w:type="dxa" w:w="5783"/>
+              <w:t>2</w:t>
+            </w:r>
+          </w:p>
+        </w:tc>
+        <w:tc>
+          <w:tcPr>
+            <w:tcW w:type="dxa" w:w="907"/>
             <w:shd w:val="clear" w:color="auto" w:fill="F7F4EF"/>
             <w:tcBorders>
               <w:top w:val="single" w:sz="4" w:color="E2DBCF"/>
@@ -1399,13 +1432,13 @@
                 <w:color w:val="1F1D1A"/>
                 <w:sz w:val="19"/>
               </w:rPr>
-              <w:t>Токены — «единица измерения» ИИ</w:t>
-            </w:r>
-          </w:p>
-        </w:tc>
-        <w:tc>
-          <w:tcPr>
-            <w:tcW w:type="dxa" w:w="2268"/>
+              <w:t>1</w:t>
+            </w:r>
+          </w:p>
+        </w:tc>
+        <w:tc>
+          <w:tcPr>
+            <w:tcW w:type="dxa" w:w="680"/>
             <w:shd w:val="clear" w:color="auto" w:fill="F7F4EF"/>
             <w:tcBorders>
               <w:top w:val="single" w:sz="4" w:color="E2DBCF"/>
@@ -1432,15 +1465,14 @@
                 <w:color w:val="1F1D1A"/>
                 <w:sz w:val="19"/>
               </w:rPr>
-              <w:t>схема</w:t>
-            </w:r>
-          </w:p>
-        </w:tc>
-      </w:tr>
-      <w:tr>
-        <w:tc>
-          <w:tcPr>
-            <w:tcW w:type="dxa" w:w="567"/>
+              <w:t>Ср</w:t>
+            </w:r>
+          </w:p>
+        </w:tc>
+        <w:tc>
+          <w:tcPr>
+            <w:tcW w:type="dxa" w:w="5102"/>
+            <w:shd w:val="clear" w:color="auto" w:fill="F7F4EF"/>
             <w:tcBorders>
               <w:top w:val="single" w:sz="4" w:color="E2DBCF"/>
               <w:left w:val="single" w:sz="4" w:color="E2DBCF"/>
@@ -1466,13 +1498,14 @@
                 <w:color w:val="1F1D1A"/>
                 <w:sz w:val="19"/>
               </w:rPr>
-              <w:t>3</w:t>
-            </w:r>
-          </w:p>
-        </w:tc>
-        <w:tc>
-          <w:tcPr>
-            <w:tcW w:type="dxa" w:w="907"/>
+              <w:t>Токены — «единица измерения» ИИ</w:t>
+            </w:r>
+          </w:p>
+        </w:tc>
+        <w:tc>
+          <w:tcPr>
+            <w:tcW w:type="dxa" w:w="2268"/>
+            <w:shd w:val="clear" w:color="auto" w:fill="F7F4EF"/>
             <w:tcBorders>
               <w:top w:val="single" w:sz="4" w:color="E2DBCF"/>
               <w:left w:val="single" w:sz="4" w:color="E2DBCF"/>
@@ -1498,13 +1531,15 @@
                 <w:color w:val="1F1D1A"/>
                 <w:sz w:val="19"/>
               </w:rPr>
-              <w:t>2</w:t>
-            </w:r>
-          </w:p>
-        </w:tc>
-        <w:tc>
-          <w:tcPr>
-            <w:tcW w:type="dxa" w:w="5783"/>
+              <w:t>схема</w:t>
+            </w:r>
+          </w:p>
+        </w:tc>
+      </w:tr>
+      <w:tr>
+        <w:tc>
+          <w:tcPr>
+            <w:tcW w:type="dxa" w:w="567"/>
             <w:tcBorders>
               <w:top w:val="single" w:sz="4" w:color="E2DBCF"/>
               <w:left w:val="single" w:sz="4" w:color="E2DBCF"/>
@@ -1530,13 +1565,13 @@
                 <w:color w:val="1F1D1A"/>
                 <w:sz w:val="19"/>
               </w:rPr>
-              <w:t>Контекстное окно: что Claude «помнит»</w:t>
-            </w:r>
-          </w:p>
-        </w:tc>
-        <w:tc>
-          <w:tcPr>
-            <w:tcW w:type="dxa" w:w="2268"/>
+              <w:t>3</w:t>
+            </w:r>
+          </w:p>
+        </w:tc>
+        <w:tc>
+          <w:tcPr>
+            <w:tcW w:type="dxa" w:w="907"/>
             <w:tcBorders>
               <w:top w:val="single" w:sz="4" w:color="E2DBCF"/>
               <w:left w:val="single" w:sz="4" w:color="E2DBCF"/>
@@ -1562,16 +1597,13 @@
                 <w:color w:val="1F1D1A"/>
                 <w:sz w:val="19"/>
               </w:rPr>
-              <w:t>схема</w:t>
-            </w:r>
-          </w:p>
-        </w:tc>
-      </w:tr>
-      <w:tr>
-        <w:tc>
-          <w:tcPr>
-            <w:tcW w:type="dxa" w:w="567"/>
-            <w:shd w:val="clear" w:color="auto" w:fill="F7F4EF"/>
+              <w:t>1</w:t>
+            </w:r>
+          </w:p>
+        </w:tc>
+        <w:tc>
+          <w:tcPr>
+            <w:tcW w:type="dxa" w:w="680"/>
             <w:tcBorders>
               <w:top w:val="single" w:sz="4" w:color="E2DBCF"/>
               <w:left w:val="single" w:sz="4" w:color="E2DBCF"/>
@@ -1597,14 +1629,13 @@
                 <w:color w:val="1F1D1A"/>
                 <w:sz w:val="19"/>
               </w:rPr>
-              <w:t>4</w:t>
-            </w:r>
-          </w:p>
-        </w:tc>
-        <w:tc>
-          <w:tcPr>
-            <w:tcW w:type="dxa" w:w="907"/>
-            <w:shd w:val="clear" w:color="auto" w:fill="F7F4EF"/>
+              <w:t>Пт</w:t>
+            </w:r>
+          </w:p>
+        </w:tc>
+        <w:tc>
+          <w:tcPr>
+            <w:tcW w:type="dxa" w:w="5102"/>
             <w:tcBorders>
               <w:top w:val="single" w:sz="4" w:color="E2DBCF"/>
               <w:left w:val="single" w:sz="4" w:color="E2DBCF"/>
@@ -1630,14 +1661,13 @@
                 <w:color w:val="1F1D1A"/>
                 <w:sz w:val="19"/>
               </w:rPr>
-              <w:t>2</w:t>
-            </w:r>
-          </w:p>
-        </w:tc>
-        <w:tc>
-          <w:tcPr>
-            <w:tcW w:type="dxa" w:w="5783"/>
-            <w:shd w:val="clear" w:color="auto" w:fill="F7F4EF"/>
+              <w:t>Контекстное окно: что Claude «помнит»</w:t>
+            </w:r>
+          </w:p>
+        </w:tc>
+        <w:tc>
+          <w:tcPr>
+            <w:tcW w:type="dxa" w:w="2268"/>
             <w:tcBorders>
               <w:top w:val="single" w:sz="4" w:color="E2DBCF"/>
               <w:left w:val="single" w:sz="4" w:color="E2DBCF"/>
@@ -1663,13 +1693,15 @@
                 <w:color w:val="1F1D1A"/>
                 <w:sz w:val="19"/>
               </w:rPr>
-              <w:t>Лимиты: почему «закончились сообщения» и как экономить</w:t>
-            </w:r>
-          </w:p>
-        </w:tc>
-        <w:tc>
-          <w:tcPr>
-            <w:tcW w:type="dxa" w:w="2268"/>
+              <w:t>схема</w:t>
+            </w:r>
+          </w:p>
+        </w:tc>
+      </w:tr>
+      <w:tr>
+        <w:tc>
+          <w:tcPr>
+            <w:tcW w:type="dxa" w:w="567"/>
             <w:shd w:val="clear" w:color="auto" w:fill="F7F4EF"/>
             <w:tcBorders>
               <w:top w:val="single" w:sz="4" w:color="E2DBCF"/>
@@ -1696,15 +1728,14 @@
                 <w:color w:val="1F1D1A"/>
                 <w:sz w:val="19"/>
               </w:rPr>
-              <w:t>скриншот</w:t>
-            </w:r>
-          </w:p>
-        </w:tc>
-      </w:tr>
-      <w:tr>
-        <w:tc>
-          <w:tcPr>
-            <w:tcW w:type="dxa" w:w="567"/>
+              <w:t>4</w:t>
+            </w:r>
+          </w:p>
+        </w:tc>
+        <w:tc>
+          <w:tcPr>
+            <w:tcW w:type="dxa" w:w="907"/>
+            <w:shd w:val="clear" w:color="auto" w:fill="F7F4EF"/>
             <w:tcBorders>
               <w:top w:val="single" w:sz="4" w:color="E2DBCF"/>
               <w:left w:val="single" w:sz="4" w:color="E2DBCF"/>
@@ -1730,13 +1761,14 @@
                 <w:color w:val="1F1D1A"/>
                 <w:sz w:val="19"/>
               </w:rPr>
-              <w:t>5</w:t>
-            </w:r>
-          </w:p>
-        </w:tc>
-        <w:tc>
-          <w:tcPr>
-            <w:tcW w:type="dxa" w:w="907"/>
+              <w:t>2</w:t>
+            </w:r>
+          </w:p>
+        </w:tc>
+        <w:tc>
+          <w:tcPr>
+            <w:tcW w:type="dxa" w:w="680"/>
+            <w:shd w:val="clear" w:color="auto" w:fill="F7F4EF"/>
             <w:tcBorders>
               <w:top w:val="single" w:sz="4" w:color="E2DBCF"/>
               <w:left w:val="single" w:sz="4" w:color="E2DBCF"/>
@@ -1762,13 +1794,14 @@
                 <w:color w:val="1F1D1A"/>
                 <w:sz w:val="19"/>
               </w:rPr>
-              <w:t>3</w:t>
-            </w:r>
-          </w:p>
-        </w:tc>
-        <w:tc>
-          <w:tcPr>
-            <w:tcW w:type="dxa" w:w="5783"/>
+              <w:t>Пн</w:t>
+            </w:r>
+          </w:p>
+        </w:tc>
+        <w:tc>
+          <w:tcPr>
+            <w:tcW w:type="dxa" w:w="5102"/>
+            <w:shd w:val="clear" w:color="auto" w:fill="F7F4EF"/>
             <w:tcBorders>
               <w:top w:val="single" w:sz="4" w:color="E2DBCF"/>
               <w:left w:val="single" w:sz="4" w:color="E2DBCF"/>
@@ -1794,13 +1827,14 @@
                 <w:color w:val="1F1D1A"/>
                 <w:sz w:val="19"/>
               </w:rPr>
-              <w:t>Модели Claude: какую выбрать</w:t>
+              <w:t>Лимиты: почему «закончились сообщения» и как экономить</w:t>
             </w:r>
           </w:p>
         </w:tc>
         <w:tc>
           <w:tcPr>
             <w:tcW w:type="dxa" w:w="2268"/>
+            <w:shd w:val="clear" w:color="auto" w:fill="F7F4EF"/>
             <w:tcBorders>
               <w:top w:val="single" w:sz="4" w:color="E2DBCF"/>
               <w:left w:val="single" w:sz="4" w:color="E2DBCF"/>
@@ -1835,7 +1869,6 @@
         <w:tc>
           <w:tcPr>
             <w:tcW w:type="dxa" w:w="567"/>
-            <w:shd w:val="clear" w:color="auto" w:fill="F7F4EF"/>
             <w:tcBorders>
               <w:top w:val="single" w:sz="4" w:color="E2DBCF"/>
               <w:left w:val="single" w:sz="4" w:color="E2DBCF"/>
@@ -1861,14 +1894,13 @@
                 <w:color w:val="1F1D1A"/>
                 <w:sz w:val="19"/>
               </w:rPr>
-              <w:t>6</w:t>
+              <w:t>5</w:t>
             </w:r>
           </w:p>
         </w:tc>
         <w:tc>
           <w:tcPr>
             <w:tcW w:type="dxa" w:w="907"/>
-            <w:shd w:val="clear" w:color="auto" w:fill="F7F4EF"/>
             <w:tcBorders>
               <w:top w:val="single" w:sz="4" w:color="E2DBCF"/>
               <w:left w:val="single" w:sz="4" w:color="E2DBCF"/>
@@ -1894,14 +1926,13 @@
                 <w:color w:val="1F1D1A"/>
                 <w:sz w:val="19"/>
               </w:rPr>
-              <w:t>3</w:t>
-            </w:r>
-          </w:p>
-        </w:tc>
-        <w:tc>
-          <w:tcPr>
-            <w:tcW w:type="dxa" w:w="5783"/>
-            <w:shd w:val="clear" w:color="auto" w:fill="F7F4EF"/>
+              <w:t>2</w:t>
+            </w:r>
+          </w:p>
+        </w:tc>
+        <w:tc>
+          <w:tcPr>
+            <w:tcW w:type="dxa" w:w="680"/>
             <w:tcBorders>
               <w:top w:val="single" w:sz="4" w:color="E2DBCF"/>
               <w:left w:val="single" w:sz="4" w:color="E2DBCF"/>
@@ -1927,14 +1958,13 @@
                 <w:color w:val="1F1D1A"/>
                 <w:sz w:val="19"/>
               </w:rPr>
-              <w:t>Галлюцинации: почему ИИ уверенно ошибается</w:t>
-            </w:r>
-          </w:p>
-        </w:tc>
-        <w:tc>
-          <w:tcPr>
-            <w:tcW w:type="dxa" w:w="2268"/>
-            <w:shd w:val="clear" w:color="auto" w:fill="F7F4EF"/>
+              <w:t>Ср</w:t>
+            </w:r>
+          </w:p>
+        </w:tc>
+        <w:tc>
+          <w:tcPr>
+            <w:tcW w:type="dxa" w:w="5102"/>
             <w:tcBorders>
               <w:top w:val="single" w:sz="4" w:color="E2DBCF"/>
               <w:left w:val="single" w:sz="4" w:color="E2DBCF"/>
@@ -1960,15 +1990,13 @@
                 <w:color w:val="1F1D1A"/>
                 <w:sz w:val="19"/>
               </w:rPr>
-              <w:t>скриншот</w:t>
-            </w:r>
-          </w:p>
-        </w:tc>
-      </w:tr>
-      <w:tr>
-        <w:tc>
-          <w:tcPr>
-            <w:tcW w:type="dxa" w:w="567"/>
+              <w:t>Модели Claude: какую выбрать</w:t>
+            </w:r>
+          </w:p>
+        </w:tc>
+        <w:tc>
+          <w:tcPr>
+            <w:tcW w:type="dxa" w:w="2268"/>
             <w:tcBorders>
               <w:top w:val="single" w:sz="4" w:color="E2DBCF"/>
               <w:left w:val="single" w:sz="4" w:color="E2DBCF"/>
@@ -1994,13 +2022,16 @@
                 <w:color w:val="1F1D1A"/>
                 <w:sz w:val="19"/>
               </w:rPr>
-              <w:t>7</w:t>
-            </w:r>
-          </w:p>
-        </w:tc>
-        <w:tc>
-          <w:tcPr>
-            <w:tcW w:type="dxa" w:w="907"/>
+              <w:t>скриншот</w:t>
+            </w:r>
+          </w:p>
+        </w:tc>
+      </w:tr>
+      <w:tr>
+        <w:tc>
+          <w:tcPr>
+            <w:tcW w:type="dxa" w:w="567"/>
+            <w:shd w:val="clear" w:color="auto" w:fill="F7F4EF"/>
             <w:tcBorders>
               <w:top w:val="single" w:sz="4" w:color="E2DBCF"/>
               <w:left w:val="single" w:sz="4" w:color="E2DBCF"/>
@@ -2026,13 +2057,14 @@
                 <w:color w:val="1F1D1A"/>
                 <w:sz w:val="19"/>
               </w:rPr>
-              <w:t>4</w:t>
-            </w:r>
-          </w:p>
-        </w:tc>
-        <w:tc>
-          <w:tcPr>
-            <w:tcW w:type="dxa" w:w="5783"/>
+              <w:t>6</w:t>
+            </w:r>
+          </w:p>
+        </w:tc>
+        <w:tc>
+          <w:tcPr>
+            <w:tcW w:type="dxa" w:w="907"/>
+            <w:shd w:val="clear" w:color="auto" w:fill="F7F4EF"/>
             <w:tcBorders>
               <w:top w:val="single" w:sz="4" w:color="E2DBCF"/>
               <w:left w:val="single" w:sz="4" w:color="E2DBCF"/>
@@ -2058,13 +2090,14 @@
                 <w:color w:val="1F1D1A"/>
                 <w:sz w:val="19"/>
               </w:rPr>
-              <w:t>Конфиденциальность: что можно и что нельзя загружать</w:t>
-            </w:r>
-          </w:p>
-        </w:tc>
-        <w:tc>
-          <w:tcPr>
-            <w:tcW w:type="dxa" w:w="2268"/>
+              <w:t>2</w:t>
+            </w:r>
+          </w:p>
+        </w:tc>
+        <w:tc>
+          <w:tcPr>
+            <w:tcW w:type="dxa" w:w="680"/>
+            <w:shd w:val="clear" w:color="auto" w:fill="F7F4EF"/>
             <w:tcBorders>
               <w:top w:val="single" w:sz="4" w:color="E2DBCF"/>
               <w:left w:val="single" w:sz="4" w:color="E2DBCF"/>
@@ -2090,15 +2123,13 @@
                 <w:color w:val="1F1D1A"/>
                 <w:sz w:val="19"/>
               </w:rPr>
-              <w:t>карточка</w:t>
-            </w:r>
-          </w:p>
-        </w:tc>
-      </w:tr>
-      <w:tr>
-        <w:tc>
-          <w:tcPr>
-            <w:tcW w:type="dxa" w:w="567"/>
+              <w:t>Пт</w:t>
+            </w:r>
+          </w:p>
+        </w:tc>
+        <w:tc>
+          <w:tcPr>
+            <w:tcW w:type="dxa" w:w="5102"/>
             <w:shd w:val="clear" w:color="auto" w:fill="F7F4EF"/>
             <w:tcBorders>
               <w:top w:val="single" w:sz="4" w:color="E2DBCF"/>
@@ -2125,13 +2156,13 @@
                 <w:color w:val="1F1D1A"/>
                 <w:sz w:val="19"/>
               </w:rPr>
-              <w:t>8</w:t>
-            </w:r>
-          </w:p>
-        </w:tc>
-        <w:tc>
-          <w:tcPr>
-            <w:tcW w:type="dxa" w:w="907"/>
+              <w:t>Галлюцинации: почему ИИ уверенно ошибается</w:t>
+            </w:r>
+          </w:p>
+        </w:tc>
+        <w:tc>
+          <w:tcPr>
+            <w:tcW w:type="dxa" w:w="2268"/>
             <w:shd w:val="clear" w:color="auto" w:fill="F7F4EF"/>
             <w:tcBorders>
               <w:top w:val="single" w:sz="4" w:color="E2DBCF"/>
@@ -2158,14 +2189,15 @@
                 <w:color w:val="1F1D1A"/>
                 <w:sz w:val="19"/>
               </w:rPr>
-              <w:t>4</w:t>
-            </w:r>
-          </w:p>
-        </w:tc>
-        <w:tc>
-          <w:tcPr>
-            <w:tcW w:type="dxa" w:w="5783"/>
-            <w:shd w:val="clear" w:color="auto" w:fill="F7F4EF"/>
+              <w:t>скриншот</w:t>
+            </w:r>
+          </w:p>
+        </w:tc>
+      </w:tr>
+      <w:tr>
+        <w:tc>
+          <w:tcPr>
+            <w:tcW w:type="dxa" w:w="567"/>
             <w:tcBorders>
               <w:top w:val="single" w:sz="4" w:color="E2DBCF"/>
               <w:left w:val="single" w:sz="4" w:color="E2DBCF"/>
@@ -2191,14 +2223,13 @@
                 <w:color w:val="1F1D1A"/>
                 <w:sz w:val="19"/>
               </w:rPr>
-              <w:t>Анатомия хорошего промта</w:t>
-            </w:r>
-          </w:p>
-        </w:tc>
-        <w:tc>
-          <w:tcPr>
-            <w:tcW w:type="dxa" w:w="2268"/>
-            <w:shd w:val="clear" w:color="auto" w:fill="F7F4EF"/>
+              <w:t>7</w:t>
+            </w:r>
+          </w:p>
+        </w:tc>
+        <w:tc>
+          <w:tcPr>
+            <w:tcW w:type="dxa" w:w="907"/>
             <w:tcBorders>
               <w:top w:val="single" w:sz="4" w:color="E2DBCF"/>
               <w:left w:val="single" w:sz="4" w:color="E2DBCF"/>
@@ -2224,15 +2255,13 @@
                 <w:color w:val="1F1D1A"/>
                 <w:sz w:val="19"/>
               </w:rPr>
-              <w:t>схема, документ</w:t>
-            </w:r>
-          </w:p>
-        </w:tc>
-      </w:tr>
-      <w:tr>
-        <w:tc>
-          <w:tcPr>
-            <w:tcW w:type="dxa" w:w="567"/>
+              <w:t>3</w:t>
+            </w:r>
+          </w:p>
+        </w:tc>
+        <w:tc>
+          <w:tcPr>
+            <w:tcW w:type="dxa" w:w="680"/>
             <w:tcBorders>
               <w:top w:val="single" w:sz="4" w:color="E2DBCF"/>
               <w:left w:val="single" w:sz="4" w:color="E2DBCF"/>
@@ -2258,13 +2287,13 @@
                 <w:color w:val="1F1D1A"/>
                 <w:sz w:val="19"/>
               </w:rPr>
-              <w:t>9</w:t>
-            </w:r>
-          </w:p>
-        </w:tc>
-        <w:tc>
-          <w:tcPr>
-            <w:tcW w:type="dxa" w:w="907"/>
+              <w:t>Пн</w:t>
+            </w:r>
+          </w:p>
+        </w:tc>
+        <w:tc>
+          <w:tcPr>
+            <w:tcW w:type="dxa" w:w="5102"/>
             <w:tcBorders>
               <w:top w:val="single" w:sz="4" w:color="E2DBCF"/>
               <w:left w:val="single" w:sz="4" w:color="E2DBCF"/>
@@ -2290,13 +2319,13 @@
                 <w:color w:val="1F1D1A"/>
                 <w:sz w:val="19"/>
               </w:rPr>
-              <w:t>5</w:t>
-            </w:r>
-          </w:p>
-        </w:tc>
-        <w:tc>
-          <w:tcPr>
-            <w:tcW w:type="dxa" w:w="5783"/>
+              <w:t>Конфиденциальность: что можно и что нельзя загружать</w:t>
+            </w:r>
+          </w:p>
+        </w:tc>
+        <w:tc>
+          <w:tcPr>
+            <w:tcW w:type="dxa" w:w="2268"/>
             <w:tcBorders>
               <w:top w:val="single" w:sz="4" w:color="E2DBCF"/>
               <w:left w:val="single" w:sz="4" w:color="E2DBCF"/>
@@ -2322,13 +2351,16 @@
                 <w:color w:val="1F1D1A"/>
                 <w:sz w:val="19"/>
               </w:rPr>
-              <w:t>Роль и контекст</w:t>
-            </w:r>
-          </w:p>
-        </w:tc>
-        <w:tc>
-          <w:tcPr>
-            <w:tcW w:type="dxa" w:w="2268"/>
+              <w:t>карточка</w:t>
+            </w:r>
+          </w:p>
+        </w:tc>
+      </w:tr>
+      <w:tr>
+        <w:tc>
+          <w:tcPr>
+            <w:tcW w:type="dxa" w:w="567"/>
+            <w:shd w:val="clear" w:color="auto" w:fill="F7F4EF"/>
             <w:tcBorders>
               <w:top w:val="single" w:sz="4" w:color="E2DBCF"/>
               <w:left w:val="single" w:sz="4" w:color="E2DBCF"/>
@@ -2354,15 +2386,13 @@
                 <w:color w:val="1F1D1A"/>
                 <w:sz w:val="19"/>
               </w:rPr>
-              <w:t>скриншот</w:t>
-            </w:r>
-          </w:p>
-        </w:tc>
-      </w:tr>
-      <w:tr>
-        <w:tc>
-          <w:tcPr>
-            <w:tcW w:type="dxa" w:w="567"/>
+              <w:t>8</w:t>
+            </w:r>
+          </w:p>
+        </w:tc>
+        <w:tc>
+          <w:tcPr>
+            <w:tcW w:type="dxa" w:w="907"/>
             <w:shd w:val="clear" w:color="auto" w:fill="F7F4EF"/>
             <w:tcBorders>
               <w:top w:val="single" w:sz="4" w:color="E2DBCF"/>
@@ -2389,13 +2419,13 @@
                 <w:color w:val="1F1D1A"/>
                 <w:sz w:val="19"/>
               </w:rPr>
-              <w:t>10</w:t>
-            </w:r>
-          </w:p>
-        </w:tc>
-        <w:tc>
-          <w:tcPr>
-            <w:tcW w:type="dxa" w:w="907"/>
+              <w:t>3</w:t>
+            </w:r>
+          </w:p>
+        </w:tc>
+        <w:tc>
+          <w:tcPr>
+            <w:tcW w:type="dxa" w:w="680"/>
             <w:shd w:val="clear" w:color="auto" w:fill="F7F4EF"/>
             <w:tcBorders>
               <w:top w:val="single" w:sz="4" w:color="E2DBCF"/>
@@ -2422,13 +2452,13 @@
                 <w:color w:val="1F1D1A"/>
                 <w:sz w:val="19"/>
               </w:rPr>
-              <w:t>5</w:t>
-            </w:r>
-          </w:p>
-        </w:tc>
-        <w:tc>
-          <w:tcPr>
-            <w:tcW w:type="dxa" w:w="5783"/>
+              <w:t>Ср</w:t>
+            </w:r>
+          </w:p>
+        </w:tc>
+        <w:tc>
+          <w:tcPr>
+            <w:tcW w:type="dxa" w:w="5102"/>
             <w:shd w:val="clear" w:color="auto" w:fill="F7F4EF"/>
             <w:tcBorders>
               <w:top w:val="single" w:sz="4" w:color="E2DBCF"/>
@@ -2455,7 +2485,7 @@
                 <w:color w:val="1F1D1A"/>
                 <w:sz w:val="19"/>
               </w:rPr>
-              <w:t>Формат ответа: заказывайте результат сразу</w:t>
+              <w:t>Анатомия хорошего промта</w:t>
             </w:r>
           </w:p>
         </w:tc>
@@ -2488,7 +2518,7 @@
                 <w:color w:val="1F1D1A"/>
                 <w:sz w:val="19"/>
               </w:rPr>
-              <w:t>скриншот</w:t>
+              <w:t>схема, документ</w:t>
             </w:r>
           </w:p>
         </w:tc>
@@ -2522,7 +2552,7 @@
                 <w:color w:val="1F1D1A"/>
                 <w:sz w:val="19"/>
               </w:rPr>
-              <w:t>11</w:t>
+              <w:t>9</w:t>
             </w:r>
           </w:p>
         </w:tc>
@@ -2554,13 +2584,13 @@
                 <w:color w:val="1F1D1A"/>
                 <w:sz w:val="19"/>
               </w:rPr>
-              <w:t>6</w:t>
-            </w:r>
-          </w:p>
-        </w:tc>
-        <w:tc>
-          <w:tcPr>
-            <w:tcW w:type="dxa" w:w="5783"/>
+              <w:t>3</w:t>
+            </w:r>
+          </w:p>
+        </w:tc>
+        <w:tc>
+          <w:tcPr>
+            <w:tcW w:type="dxa" w:w="680"/>
             <w:tcBorders>
               <w:top w:val="single" w:sz="4" w:color="E2DBCF"/>
               <w:left w:val="single" w:sz="4" w:color="E2DBCF"/>
@@ -2586,13 +2616,13 @@
                 <w:color w:val="1F1D1A"/>
                 <w:sz w:val="19"/>
               </w:rPr>
-              <w:t>Примеры: покажите, что хотите получить</w:t>
-            </w:r>
-          </w:p>
-        </w:tc>
-        <w:tc>
-          <w:tcPr>
-            <w:tcW w:type="dxa" w:w="2268"/>
+              <w:t>Пт</w:t>
+            </w:r>
+          </w:p>
+        </w:tc>
+        <w:tc>
+          <w:tcPr>
+            <w:tcW w:type="dxa" w:w="5102"/>
             <w:tcBorders>
               <w:top w:val="single" w:sz="4" w:color="E2DBCF"/>
               <w:left w:val="single" w:sz="4" w:color="E2DBCF"/>
@@ -2618,16 +2648,13 @@
                 <w:color w:val="1F1D1A"/>
                 <w:sz w:val="19"/>
               </w:rPr>
-              <w:t>скриншот</w:t>
-            </w:r>
-          </w:p>
-        </w:tc>
-      </w:tr>
-      <w:tr>
-        <w:tc>
-          <w:tcPr>
-            <w:tcW w:type="dxa" w:w="567"/>
-            <w:shd w:val="clear" w:color="auto" w:fill="F7F4EF"/>
+              <w:t>Роль и контекст</w:t>
+            </w:r>
+          </w:p>
+        </w:tc>
+        <w:tc>
+          <w:tcPr>
+            <w:tcW w:type="dxa" w:w="2268"/>
             <w:tcBorders>
               <w:top w:val="single" w:sz="4" w:color="E2DBCF"/>
               <w:left w:val="single" w:sz="4" w:color="E2DBCF"/>
@@ -2653,13 +2680,15 @@
                 <w:color w:val="1F1D1A"/>
                 <w:sz w:val="19"/>
               </w:rPr>
-              <w:t>12</w:t>
-            </w:r>
-          </w:p>
-        </w:tc>
-        <w:tc>
-          <w:tcPr>
-            <w:tcW w:type="dxa" w:w="907"/>
+              <w:t>скриншот</w:t>
+            </w:r>
+          </w:p>
+        </w:tc>
+      </w:tr>
+      <w:tr>
+        <w:tc>
+          <w:tcPr>
+            <w:tcW w:type="dxa" w:w="567"/>
             <w:shd w:val="clear" w:color="auto" w:fill="F7F4EF"/>
             <w:tcBorders>
               <w:top w:val="single" w:sz="4" w:color="E2DBCF"/>
@@ -2686,13 +2715,13 @@
                 <w:color w:val="1F1D1A"/>
                 <w:sz w:val="19"/>
               </w:rPr>
-              <w:t>6</w:t>
-            </w:r>
-          </w:p>
-        </w:tc>
-        <w:tc>
-          <w:tcPr>
-            <w:tcW w:type="dxa" w:w="5783"/>
+              <w:t>10</w:t>
+            </w:r>
+          </w:p>
+        </w:tc>
+        <w:tc>
+          <w:tcPr>
+            <w:tcW w:type="dxa" w:w="907"/>
             <w:shd w:val="clear" w:color="auto" w:fill="F7F4EF"/>
             <w:tcBorders>
               <w:top w:val="single" w:sz="4" w:color="E2DBCF"/>
@@ -2719,13 +2748,13 @@
                 <w:color w:val="1F1D1A"/>
                 <w:sz w:val="19"/>
               </w:rPr>
-              <w:t>Самопроверка и взгляд критика</w:t>
-            </w:r>
-          </w:p>
-        </w:tc>
-        <w:tc>
-          <w:tcPr>
-            <w:tcW w:type="dxa" w:w="2268"/>
+              <w:t>4</w:t>
+            </w:r>
+          </w:p>
+        </w:tc>
+        <w:tc>
+          <w:tcPr>
+            <w:tcW w:type="dxa" w:w="680"/>
             <w:shd w:val="clear" w:color="auto" w:fill="F7F4EF"/>
             <w:tcBorders>
               <w:top w:val="single" w:sz="4" w:color="E2DBCF"/>
@@ -2752,15 +2781,14 @@
                 <w:color w:val="1F1D1A"/>
                 <w:sz w:val="19"/>
               </w:rPr>
-              <w:t>видео</w:t>
-            </w:r>
-          </w:p>
-        </w:tc>
-      </w:tr>
-      <w:tr>
-        <w:tc>
-          <w:tcPr>
-            <w:tcW w:type="dxa" w:w="567"/>
+              <w:t>Пн</w:t>
+            </w:r>
+          </w:p>
+        </w:tc>
+        <w:tc>
+          <w:tcPr>
+            <w:tcW w:type="dxa" w:w="5102"/>
+            <w:shd w:val="clear" w:color="auto" w:fill="F7F4EF"/>
             <w:tcBorders>
               <w:top w:val="single" w:sz="4" w:color="E2DBCF"/>
               <w:left w:val="single" w:sz="4" w:color="E2DBCF"/>
@@ -2786,13 +2814,14 @@
                 <w:color w:val="1F1D1A"/>
                 <w:sz w:val="19"/>
               </w:rPr>
-              <w:t>13</w:t>
-            </w:r>
-          </w:p>
-        </w:tc>
-        <w:tc>
-          <w:tcPr>
-            <w:tcW w:type="dxa" w:w="907"/>
+              <w:t>Формат ответа: заказывайте результат сразу</w:t>
+            </w:r>
+          </w:p>
+        </w:tc>
+        <w:tc>
+          <w:tcPr>
+            <w:tcW w:type="dxa" w:w="2268"/>
+            <w:shd w:val="clear" w:color="auto" w:fill="F7F4EF"/>
             <w:tcBorders>
               <w:top w:val="single" w:sz="4" w:color="E2DBCF"/>
               <w:left w:val="single" w:sz="4" w:color="E2DBCF"/>
@@ -2818,13 +2847,15 @@
                 <w:color w:val="1F1D1A"/>
                 <w:sz w:val="19"/>
               </w:rPr>
-              <w:t>7</w:t>
-            </w:r>
-          </w:p>
-        </w:tc>
-        <w:tc>
-          <w:tcPr>
-            <w:tcW w:type="dxa" w:w="5783"/>
+              <w:t>скриншот</w:t>
+            </w:r>
+          </w:p>
+        </w:tc>
+      </w:tr>
+      <w:tr>
+        <w:tc>
+          <w:tcPr>
+            <w:tcW w:type="dxa" w:w="567"/>
             <w:tcBorders>
               <w:top w:val="single" w:sz="4" w:color="E2DBCF"/>
               <w:left w:val="single" w:sz="4" w:color="E2DBCF"/>
@@ -2850,13 +2881,13 @@
                 <w:color w:val="1F1D1A"/>
                 <w:sz w:val="19"/>
               </w:rPr>
-              <w:t>Итерации: первый ответ — это черновик</w:t>
-            </w:r>
-          </w:p>
-        </w:tc>
-        <w:tc>
-          <w:tcPr>
-            <w:tcW w:type="dxa" w:w="2268"/>
+              <w:t>11</w:t>
+            </w:r>
+          </w:p>
+        </w:tc>
+        <w:tc>
+          <w:tcPr>
+            <w:tcW w:type="dxa" w:w="907"/>
             <w:tcBorders>
               <w:top w:val="single" w:sz="4" w:color="E2DBCF"/>
               <w:left w:val="single" w:sz="4" w:color="E2DBCF"/>
@@ -2882,16 +2913,13 @@
                 <w:color w:val="1F1D1A"/>
                 <w:sz w:val="19"/>
               </w:rPr>
-              <w:t>видео</w:t>
-            </w:r>
-          </w:p>
-        </w:tc>
-      </w:tr>
-      <w:tr>
-        <w:tc>
-          <w:tcPr>
-            <w:tcW w:type="dxa" w:w="567"/>
-            <w:shd w:val="clear" w:color="auto" w:fill="F7F4EF"/>
+              <w:t>4</w:t>
+            </w:r>
+          </w:p>
+        </w:tc>
+        <w:tc>
+          <w:tcPr>
+            <w:tcW w:type="dxa" w:w="680"/>
             <w:tcBorders>
               <w:top w:val="single" w:sz="4" w:color="E2DBCF"/>
               <w:left w:val="single" w:sz="4" w:color="E2DBCF"/>
@@ -2917,14 +2945,13 @@
                 <w:color w:val="1F1D1A"/>
                 <w:sz w:val="19"/>
               </w:rPr>
-              <w:t>14</w:t>
-            </w:r>
-          </w:p>
-        </w:tc>
-        <w:tc>
-          <w:tcPr>
-            <w:tcW w:type="dxa" w:w="907"/>
-            <w:shd w:val="clear" w:color="auto" w:fill="F7F4EF"/>
+              <w:t>Ср</w:t>
+            </w:r>
+          </w:p>
+        </w:tc>
+        <w:tc>
+          <w:tcPr>
+            <w:tcW w:type="dxa" w:w="5102"/>
             <w:tcBorders>
               <w:top w:val="single" w:sz="4" w:color="E2DBCF"/>
               <w:left w:val="single" w:sz="4" w:color="E2DBCF"/>
@@ -2950,14 +2977,13 @@
                 <w:color w:val="1F1D1A"/>
                 <w:sz w:val="19"/>
               </w:rPr>
-              <w:t>7</w:t>
-            </w:r>
-          </w:p>
-        </w:tc>
-        <w:tc>
-          <w:tcPr>
-            <w:tcW w:type="dxa" w:w="5783"/>
-            <w:shd w:val="clear" w:color="auto" w:fill="F7F4EF"/>
+              <w:t>Примеры: покажите, что хотите получить</w:t>
+            </w:r>
+          </w:p>
+        </w:tc>
+        <w:tc>
+          <w:tcPr>
+            <w:tcW w:type="dxa" w:w="2268"/>
             <w:tcBorders>
               <w:top w:val="single" w:sz="4" w:color="E2DBCF"/>
               <w:left w:val="single" w:sz="4" w:color="E2DBCF"/>
@@ -2983,13 +3009,15 @@
                 <w:color w:val="1F1D1A"/>
                 <w:sz w:val="19"/>
               </w:rPr>
-              <w:t>Разбор ваших промтов</w:t>
-            </w:r>
-          </w:p>
-        </w:tc>
-        <w:tc>
-          <w:tcPr>
-            <w:tcW w:type="dxa" w:w="2268"/>
+              <w:t>скриншот</w:t>
+            </w:r>
+          </w:p>
+        </w:tc>
+      </w:tr>
+      <w:tr>
+        <w:tc>
+          <w:tcPr>
+            <w:tcW w:type="dxa" w:w="567"/>
             <w:shd w:val="clear" w:color="auto" w:fill="F7F4EF"/>
             <w:tcBorders>
               <w:top w:val="single" w:sz="4" w:color="E2DBCF"/>
@@ -3016,15 +3044,14 @@
                 <w:color w:val="1F1D1A"/>
                 <w:sz w:val="19"/>
               </w:rPr>
-              <w:t>опрос, скриншот</w:t>
-            </w:r>
-          </w:p>
-        </w:tc>
-      </w:tr>
-      <w:tr>
-        <w:tc>
-          <w:tcPr>
-            <w:tcW w:type="dxa" w:w="567"/>
+              <w:t>12</w:t>
+            </w:r>
+          </w:p>
+        </w:tc>
+        <w:tc>
+          <w:tcPr>
+            <w:tcW w:type="dxa" w:w="907"/>
+            <w:shd w:val="clear" w:color="auto" w:fill="F7F4EF"/>
             <w:tcBorders>
               <w:top w:val="single" w:sz="4" w:color="E2DBCF"/>
               <w:left w:val="single" w:sz="4" w:color="E2DBCF"/>
@@ -3050,13 +3077,14 @@
                 <w:color w:val="1F1D1A"/>
                 <w:sz w:val="19"/>
               </w:rPr>
-              <w:t>15</w:t>
-            </w:r>
-          </w:p>
-        </w:tc>
-        <w:tc>
-          <w:tcPr>
-            <w:tcW w:type="dxa" w:w="907"/>
+              <w:t>4</w:t>
+            </w:r>
+          </w:p>
+        </w:tc>
+        <w:tc>
+          <w:tcPr>
+            <w:tcW w:type="dxa" w:w="680"/>
+            <w:shd w:val="clear" w:color="auto" w:fill="F7F4EF"/>
             <w:tcBorders>
               <w:top w:val="single" w:sz="4" w:color="E2DBCF"/>
               <w:left w:val="single" w:sz="4" w:color="E2DBCF"/>
@@ -3082,13 +3110,14 @@
                 <w:color w:val="1F1D1A"/>
                 <w:sz w:val="19"/>
               </w:rPr>
-              <w:t>8</w:t>
-            </w:r>
-          </w:p>
-        </w:tc>
-        <w:tc>
-          <w:tcPr>
-            <w:tcW w:type="dxa" w:w="5783"/>
+              <w:t>Пт</w:t>
+            </w:r>
+          </w:p>
+        </w:tc>
+        <w:tc>
+          <w:tcPr>
+            <w:tcW w:type="dxa" w:w="5102"/>
+            <w:shd w:val="clear" w:color="auto" w:fill="F7F4EF"/>
             <w:tcBorders>
               <w:top w:val="single" w:sz="4" w:color="E2DBCF"/>
               <w:left w:val="single" w:sz="4" w:color="E2DBCF"/>
@@ -3114,13 +3143,14 @@
                 <w:color w:val="1F1D1A"/>
                 <w:sz w:val="19"/>
               </w:rPr>
-              <w:t>Работа с файлами</w:t>
+              <w:t>Самопроверка и взгляд критика</w:t>
             </w:r>
           </w:p>
         </w:tc>
         <w:tc>
           <w:tcPr>
             <w:tcW w:type="dxa" w:w="2268"/>
+            <w:shd w:val="clear" w:color="auto" w:fill="F7F4EF"/>
             <w:tcBorders>
               <w:top w:val="single" w:sz="4" w:color="E2DBCF"/>
               <w:left w:val="single" w:sz="4" w:color="E2DBCF"/>
@@ -3155,7 +3185,6 @@
         <w:tc>
           <w:tcPr>
             <w:tcW w:type="dxa" w:w="567"/>
-            <w:shd w:val="clear" w:color="auto" w:fill="F7F4EF"/>
             <w:tcBorders>
               <w:top w:val="single" w:sz="4" w:color="E2DBCF"/>
               <w:left w:val="single" w:sz="4" w:color="E2DBCF"/>
@@ -3181,14 +3210,13 @@
                 <w:color w:val="1F1D1A"/>
                 <w:sz w:val="19"/>
               </w:rPr>
-              <w:t>16</w:t>
+              <w:t>13</w:t>
             </w:r>
           </w:p>
         </w:tc>
         <w:tc>
           <w:tcPr>
             <w:tcW w:type="dxa" w:w="907"/>
-            <w:shd w:val="clear" w:color="auto" w:fill="F7F4EF"/>
             <w:tcBorders>
               <w:top w:val="single" w:sz="4" w:color="E2DBCF"/>
               <w:left w:val="single" w:sz="4" w:color="E2DBCF"/>
@@ -3214,14 +3242,13 @@
                 <w:color w:val="1F1D1A"/>
                 <w:sz w:val="19"/>
               </w:rPr>
-              <w:t>8</w:t>
-            </w:r>
-          </w:p>
-        </w:tc>
-        <w:tc>
-          <w:tcPr>
-            <w:tcW w:type="dxa" w:w="5783"/>
-            <w:shd w:val="clear" w:color="auto" w:fill="F7F4EF"/>
+              <w:t>5</w:t>
+            </w:r>
+          </w:p>
+        </w:tc>
+        <w:tc>
+          <w:tcPr>
+            <w:tcW w:type="dxa" w:w="680"/>
             <w:tcBorders>
               <w:top w:val="single" w:sz="4" w:color="E2DBCF"/>
               <w:left w:val="single" w:sz="4" w:color="E2DBCF"/>
@@ -3247,14 +3274,13 @@
                 <w:color w:val="1F1D1A"/>
                 <w:sz w:val="19"/>
               </w:rPr>
-              <w:t>Проекты: один раз объяснить, всегда пользоваться</w:t>
-            </w:r>
-          </w:p>
-        </w:tc>
-        <w:tc>
-          <w:tcPr>
-            <w:tcW w:type="dxa" w:w="2268"/>
-            <w:shd w:val="clear" w:color="auto" w:fill="F7F4EF"/>
+              <w:t>Пн</w:t>
+            </w:r>
+          </w:p>
+        </w:tc>
+        <w:tc>
+          <w:tcPr>
+            <w:tcW w:type="dxa" w:w="5102"/>
             <w:tcBorders>
               <w:top w:val="single" w:sz="4" w:color="E2DBCF"/>
               <w:left w:val="single" w:sz="4" w:color="E2DBCF"/>
@@ -3280,15 +3306,13 @@
                 <w:color w:val="1F1D1A"/>
                 <w:sz w:val="19"/>
               </w:rPr>
-              <w:t>видео</w:t>
-            </w:r>
-          </w:p>
-        </w:tc>
-      </w:tr>
-      <w:tr>
-        <w:tc>
-          <w:tcPr>
-            <w:tcW w:type="dxa" w:w="567"/>
+              <w:t>Итерации: первый ответ — это черновик</w:t>
+            </w:r>
+          </w:p>
+        </w:tc>
+        <w:tc>
+          <w:tcPr>
+            <w:tcW w:type="dxa" w:w="2268"/>
             <w:tcBorders>
               <w:top w:val="single" w:sz="4" w:color="E2DBCF"/>
               <w:left w:val="single" w:sz="4" w:color="E2DBCF"/>
@@ -3314,13 +3338,16 @@
                 <w:color w:val="1F1D1A"/>
                 <w:sz w:val="19"/>
               </w:rPr>
-              <w:t>17</w:t>
-            </w:r>
-          </w:p>
-        </w:tc>
-        <w:tc>
-          <w:tcPr>
-            <w:tcW w:type="dxa" w:w="907"/>
+              <w:t>видео</w:t>
+            </w:r>
+          </w:p>
+        </w:tc>
+      </w:tr>
+      <w:tr>
+        <w:tc>
+          <w:tcPr>
+            <w:tcW w:type="dxa" w:w="567"/>
+            <w:shd w:val="clear" w:color="auto" w:fill="F7F4EF"/>
             <w:tcBorders>
               <w:top w:val="single" w:sz="4" w:color="E2DBCF"/>
               <w:left w:val="single" w:sz="4" w:color="E2DBCF"/>
@@ -3346,13 +3373,14 @@
                 <w:color w:val="1F1D1A"/>
                 <w:sz w:val="19"/>
               </w:rPr>
-              <w:t>9</w:t>
-            </w:r>
-          </w:p>
-        </w:tc>
-        <w:tc>
-          <w:tcPr>
-            <w:tcW w:type="dxa" w:w="5783"/>
+              <w:t>14</w:t>
+            </w:r>
+          </w:p>
+        </w:tc>
+        <w:tc>
+          <w:tcPr>
+            <w:tcW w:type="dxa" w:w="907"/>
+            <w:shd w:val="clear" w:color="auto" w:fill="F7F4EF"/>
             <w:tcBorders>
               <w:top w:val="single" w:sz="4" w:color="E2DBCF"/>
               <w:left w:val="single" w:sz="4" w:color="E2DBCF"/>
@@ -3378,13 +3406,14 @@
                 <w:color w:val="1F1D1A"/>
                 <w:sz w:val="19"/>
               </w:rPr>
-              <w:t>Расширенное мышление и веб-поиск</w:t>
-            </w:r>
-          </w:p>
-        </w:tc>
-        <w:tc>
-          <w:tcPr>
-            <w:tcW w:type="dxa" w:w="2268"/>
+              <w:t>5</w:t>
+            </w:r>
+          </w:p>
+        </w:tc>
+        <w:tc>
+          <w:tcPr>
+            <w:tcW w:type="dxa" w:w="680"/>
+            <w:shd w:val="clear" w:color="auto" w:fill="F7F4EF"/>
             <w:tcBorders>
               <w:top w:val="single" w:sz="4" w:color="E2DBCF"/>
               <w:left w:val="single" w:sz="4" w:color="E2DBCF"/>
@@ -3410,15 +3439,13 @@
                 <w:color w:val="1F1D1A"/>
                 <w:sz w:val="19"/>
               </w:rPr>
-              <w:t>скриншот</w:t>
-            </w:r>
-          </w:p>
-        </w:tc>
-      </w:tr>
-      <w:tr>
-        <w:tc>
-          <w:tcPr>
-            <w:tcW w:type="dxa" w:w="567"/>
+              <w:t>Ср</w:t>
+            </w:r>
+          </w:p>
+        </w:tc>
+        <w:tc>
+          <w:tcPr>
+            <w:tcW w:type="dxa" w:w="5102"/>
             <w:shd w:val="clear" w:color="auto" w:fill="F7F4EF"/>
             <w:tcBorders>
               <w:top w:val="single" w:sz="4" w:color="E2DBCF"/>
@@ -3445,13 +3472,13 @@
                 <w:color w:val="1F1D1A"/>
                 <w:sz w:val="19"/>
               </w:rPr>
-              <w:t>18</w:t>
-            </w:r>
-          </w:p>
-        </w:tc>
-        <w:tc>
-          <w:tcPr>
-            <w:tcW w:type="dxa" w:w="907"/>
+              <w:t>Разбор ваших промтов</w:t>
+            </w:r>
+          </w:p>
+        </w:tc>
+        <w:tc>
+          <w:tcPr>
+            <w:tcW w:type="dxa" w:w="2268"/>
             <w:shd w:val="clear" w:color="auto" w:fill="F7F4EF"/>
             <w:tcBorders>
               <w:top w:val="single" w:sz="4" w:color="E2DBCF"/>
@@ -3478,14 +3505,15 @@
                 <w:color w:val="1F1D1A"/>
                 <w:sz w:val="19"/>
               </w:rPr>
-              <w:t>9</w:t>
-            </w:r>
-          </w:p>
-        </w:tc>
-        <w:tc>
-          <w:tcPr>
-            <w:tcW w:type="dxa" w:w="5783"/>
-            <w:shd w:val="clear" w:color="auto" w:fill="F7F4EF"/>
+              <w:t>опрос, скриншот</w:t>
+            </w:r>
+          </w:p>
+        </w:tc>
+      </w:tr>
+      <w:tr>
+        <w:tc>
+          <w:tcPr>
+            <w:tcW w:type="dxa" w:w="567"/>
             <w:tcBorders>
               <w:top w:val="single" w:sz="4" w:color="E2DBCF"/>
               <w:left w:val="single" w:sz="4" w:color="E2DBCF"/>
@@ -3511,14 +3539,13 @@
                 <w:color w:val="1F1D1A"/>
                 <w:sz w:val="19"/>
               </w:rPr>
-              <w:t>Артефакты: документы, таблицы и схемы прямо в чате</w:t>
-            </w:r>
-          </w:p>
-        </w:tc>
-        <w:tc>
-          <w:tcPr>
-            <w:tcW w:type="dxa" w:w="2268"/>
-            <w:shd w:val="clear" w:color="auto" w:fill="F7F4EF"/>
+              <w:t>15</w:t>
+            </w:r>
+          </w:p>
+        </w:tc>
+        <w:tc>
+          <w:tcPr>
+            <w:tcW w:type="dxa" w:w="907"/>
             <w:tcBorders>
               <w:top w:val="single" w:sz="4" w:color="E2DBCF"/>
               <w:left w:val="single" w:sz="4" w:color="E2DBCF"/>
@@ -3544,15 +3571,13 @@
                 <w:color w:val="1F1D1A"/>
                 <w:sz w:val="19"/>
               </w:rPr>
-              <w:t>видео</w:t>
-            </w:r>
-          </w:p>
-        </w:tc>
-      </w:tr>
-      <w:tr>
-        <w:tc>
-          <w:tcPr>
-            <w:tcW w:type="dxa" w:w="567"/>
+              <w:t>5</w:t>
+            </w:r>
+          </w:p>
+        </w:tc>
+        <w:tc>
+          <w:tcPr>
+            <w:tcW w:type="dxa" w:w="680"/>
             <w:tcBorders>
               <w:top w:val="single" w:sz="4" w:color="E2DBCF"/>
               <w:left w:val="single" w:sz="4" w:color="E2DBCF"/>
@@ -3578,13 +3603,13 @@
                 <w:color w:val="1F1D1A"/>
                 <w:sz w:val="19"/>
               </w:rPr>
-              <w:t>19</w:t>
-            </w:r>
-          </w:p>
-        </w:tc>
-        <w:tc>
-          <w:tcPr>
-            <w:tcW w:type="dxa" w:w="907"/>
+              <w:t>Пт</w:t>
+            </w:r>
+          </w:p>
+        </w:tc>
+        <w:tc>
+          <w:tcPr>
+            <w:tcW w:type="dxa" w:w="5102"/>
             <w:tcBorders>
               <w:top w:val="single" w:sz="4" w:color="E2DBCF"/>
               <w:left w:val="single" w:sz="4" w:color="E2DBCF"/>
@@ -3610,13 +3635,13 @@
                 <w:color w:val="1F1D1A"/>
                 <w:sz w:val="19"/>
               </w:rPr>
-              <w:t>10</w:t>
-            </w:r>
-          </w:p>
-        </w:tc>
-        <w:tc>
-          <w:tcPr>
-            <w:tcW w:type="dxa" w:w="5783"/>
+              <w:t>Работа с файлами</w:t>
+            </w:r>
+          </w:p>
+        </w:tc>
+        <w:tc>
+          <w:tcPr>
+            <w:tcW w:type="dxa" w:w="2268"/>
             <w:tcBorders>
               <w:top w:val="single" w:sz="4" w:color="E2DBCF"/>
               <w:left w:val="single" w:sz="4" w:color="E2DBCF"/>
@@ -3642,13 +3667,16 @@
                 <w:color w:val="1F1D1A"/>
                 <w:sz w:val="19"/>
               </w:rPr>
-              <w:t>Chat или Code: где работать</w:t>
-            </w:r>
-          </w:p>
-        </w:tc>
-        <w:tc>
-          <w:tcPr>
-            <w:tcW w:type="dxa" w:w="2268"/>
+              <w:t>видео</w:t>
+            </w:r>
+          </w:p>
+        </w:tc>
+      </w:tr>
+      <w:tr>
+        <w:tc>
+          <w:tcPr>
+            <w:tcW w:type="dxa" w:w="567"/>
+            <w:shd w:val="clear" w:color="auto" w:fill="F7F4EF"/>
             <w:tcBorders>
               <w:top w:val="single" w:sz="4" w:color="E2DBCF"/>
               <w:left w:val="single" w:sz="4" w:color="E2DBCF"/>
@@ -3674,15 +3702,13 @@
                 <w:color w:val="1F1D1A"/>
                 <w:sz w:val="19"/>
               </w:rPr>
-              <w:t>схема</w:t>
-            </w:r>
-          </w:p>
-        </w:tc>
-      </w:tr>
-      <w:tr>
-        <w:tc>
-          <w:tcPr>
-            <w:tcW w:type="dxa" w:w="567"/>
+              <w:t>16</w:t>
+            </w:r>
+          </w:p>
+        </w:tc>
+        <w:tc>
+          <w:tcPr>
+            <w:tcW w:type="dxa" w:w="907"/>
             <w:shd w:val="clear" w:color="auto" w:fill="F7F4EF"/>
             <w:tcBorders>
               <w:top w:val="single" w:sz="4" w:color="E2DBCF"/>
@@ -3709,13 +3735,13 @@
                 <w:color w:val="1F1D1A"/>
                 <w:sz w:val="19"/>
               </w:rPr>
-              <w:t>20</w:t>
-            </w:r>
-          </w:p>
-        </w:tc>
-        <w:tc>
-          <w:tcPr>
-            <w:tcW w:type="dxa" w:w="907"/>
+              <w:t>6</w:t>
+            </w:r>
+          </w:p>
+        </w:tc>
+        <w:tc>
+          <w:tcPr>
+            <w:tcW w:type="dxa" w:w="680"/>
             <w:shd w:val="clear" w:color="auto" w:fill="F7F4EF"/>
             <w:tcBorders>
               <w:top w:val="single" w:sz="4" w:color="E2DBCF"/>
@@ -3742,13 +3768,13 @@
                 <w:color w:val="1F1D1A"/>
                 <w:sz w:val="19"/>
               </w:rPr>
-              <w:t>10</w:t>
-            </w:r>
-          </w:p>
-        </w:tc>
-        <w:tc>
-          <w:tcPr>
-            <w:tcW w:type="dxa" w:w="5783"/>
+              <w:t>Пн</w:t>
+            </w:r>
+          </w:p>
+        </w:tc>
+        <w:tc>
+          <w:tcPr>
+            <w:tcW w:type="dxa" w:w="5102"/>
             <w:shd w:val="clear" w:color="auto" w:fill="F7F4EF"/>
             <w:tcBorders>
               <w:top w:val="single" w:sz="4" w:color="E2DBCF"/>
@@ -3775,7 +3801,7 @@
                 <w:color w:val="1F1D1A"/>
                 <w:sz w:val="19"/>
               </w:rPr>
-              <w:t>Первый запуск Code</w:t>
+              <w:t>Проекты: один раз объяснить, всегда пользоваться</w:t>
             </w:r>
           </w:p>
         </w:tc>
@@ -3808,7 +3834,7 @@
                 <w:color w:val="1F1D1A"/>
                 <w:sz w:val="19"/>
               </w:rPr>
-              <w:t>видео, скриншот</w:t>
+              <w:t>видео</w:t>
             </w:r>
           </w:p>
         </w:tc>
@@ -3842,7 +3868,7 @@
                 <w:color w:val="1F1D1A"/>
                 <w:sz w:val="19"/>
               </w:rPr>
-              <w:t>21</w:t>
+              <w:t>17</w:t>
             </w:r>
           </w:p>
         </w:tc>
@@ -3874,13 +3900,13 @@
                 <w:color w:val="1F1D1A"/>
                 <w:sz w:val="19"/>
               </w:rPr>
-              <w:t>11</w:t>
-            </w:r>
-          </w:p>
-        </w:tc>
-        <w:tc>
-          <w:tcPr>
-            <w:tcW w:type="dxa" w:w="5783"/>
+              <w:t>6</w:t>
+            </w:r>
+          </w:p>
+        </w:tc>
+        <w:tc>
+          <w:tcPr>
+            <w:tcW w:type="dxa" w:w="680"/>
             <w:tcBorders>
               <w:top w:val="single" w:sz="4" w:color="E2DBCF"/>
               <w:left w:val="single" w:sz="4" w:color="E2DBCF"/>
@@ -3906,13 +3932,13 @@
                 <w:color w:val="1F1D1A"/>
                 <w:sz w:val="19"/>
               </w:rPr>
-              <w:t>Правка документов прямо в папке</w:t>
-            </w:r>
-          </w:p>
-        </w:tc>
-        <w:tc>
-          <w:tcPr>
-            <w:tcW w:type="dxa" w:w="2268"/>
+              <w:t>Ср</w:t>
+            </w:r>
+          </w:p>
+        </w:tc>
+        <w:tc>
+          <w:tcPr>
+            <w:tcW w:type="dxa" w:w="5102"/>
             <w:tcBorders>
               <w:top w:val="single" w:sz="4" w:color="E2DBCF"/>
               <w:left w:val="single" w:sz="4" w:color="E2DBCF"/>
@@ -3938,16 +3964,13 @@
                 <w:color w:val="1F1D1A"/>
                 <w:sz w:val="19"/>
               </w:rPr>
-              <w:t>видео</w:t>
-            </w:r>
-          </w:p>
-        </w:tc>
-      </w:tr>
-      <w:tr>
-        <w:tc>
-          <w:tcPr>
-            <w:tcW w:type="dxa" w:w="567"/>
-            <w:shd w:val="clear" w:color="auto" w:fill="F7F4EF"/>
+              <w:t>Расширенное мышление и веб-поиск</w:t>
+            </w:r>
+          </w:p>
+        </w:tc>
+        <w:tc>
+          <w:tcPr>
+            <w:tcW w:type="dxa" w:w="2268"/>
             <w:tcBorders>
               <w:top w:val="single" w:sz="4" w:color="E2DBCF"/>
               <w:left w:val="single" w:sz="4" w:color="E2DBCF"/>
@@ -3973,13 +3996,15 @@
                 <w:color w:val="1F1D1A"/>
                 <w:sz w:val="19"/>
               </w:rPr>
-              <w:t>22</w:t>
-            </w:r>
-          </w:p>
-        </w:tc>
-        <w:tc>
-          <w:tcPr>
-            <w:tcW w:type="dxa" w:w="907"/>
+              <w:t>скриншот</w:t>
+            </w:r>
+          </w:p>
+        </w:tc>
+      </w:tr>
+      <w:tr>
+        <w:tc>
+          <w:tcPr>
+            <w:tcW w:type="dxa" w:w="567"/>
             <w:shd w:val="clear" w:color="auto" w:fill="F7F4EF"/>
             <w:tcBorders>
               <w:top w:val="single" w:sz="4" w:color="E2DBCF"/>
@@ -4006,13 +4031,13 @@
                 <w:color w:val="1F1D1A"/>
                 <w:sz w:val="19"/>
               </w:rPr>
-              <w:t>11</w:t>
-            </w:r>
-          </w:p>
-        </w:tc>
-        <w:tc>
-          <w:tcPr>
-            <w:tcW w:type="dxa" w:w="5783"/>
+              <w:t>18</w:t>
+            </w:r>
+          </w:p>
+        </w:tc>
+        <w:tc>
+          <w:tcPr>
+            <w:tcW w:type="dxa" w:w="907"/>
             <w:shd w:val="clear" w:color="auto" w:fill="F7F4EF"/>
             <w:tcBorders>
               <w:top w:val="single" w:sz="4" w:color="E2DBCF"/>
@@ -4039,13 +4064,13 @@
                 <w:color w:val="1F1D1A"/>
                 <w:sz w:val="19"/>
               </w:rPr>
-              <w:t>Расчёты кодом</w:t>
-            </w:r>
-          </w:p>
-        </w:tc>
-        <w:tc>
-          <w:tcPr>
-            <w:tcW w:type="dxa" w:w="2268"/>
+              <w:t>6</w:t>
+            </w:r>
+          </w:p>
+        </w:tc>
+        <w:tc>
+          <w:tcPr>
+            <w:tcW w:type="dxa" w:w="680"/>
             <w:shd w:val="clear" w:color="auto" w:fill="F7F4EF"/>
             <w:tcBorders>
               <w:top w:val="single" w:sz="4" w:color="E2DBCF"/>
@@ -4072,15 +4097,14 @@
                 <w:color w:val="1F1D1A"/>
                 <w:sz w:val="19"/>
               </w:rPr>
-              <w:t>видео</w:t>
-            </w:r>
-          </w:p>
-        </w:tc>
-      </w:tr>
-      <w:tr>
-        <w:tc>
-          <w:tcPr>
-            <w:tcW w:type="dxa" w:w="567"/>
+              <w:t>Пт</w:t>
+            </w:r>
+          </w:p>
+        </w:tc>
+        <w:tc>
+          <w:tcPr>
+            <w:tcW w:type="dxa" w:w="5102"/>
+            <w:shd w:val="clear" w:color="auto" w:fill="F7F4EF"/>
             <w:tcBorders>
               <w:top w:val="single" w:sz="4" w:color="E2DBCF"/>
               <w:left w:val="single" w:sz="4" w:color="E2DBCF"/>
@@ -4106,13 +4130,14 @@
                 <w:color w:val="1F1D1A"/>
                 <w:sz w:val="19"/>
               </w:rPr>
-              <w:t>23</w:t>
-            </w:r>
-          </w:p>
-        </w:tc>
-        <w:tc>
-          <w:tcPr>
-            <w:tcW w:type="dxa" w:w="907"/>
+              <w:t>Артефакты: документы, таблицы и схемы прямо в чате</w:t>
+            </w:r>
+          </w:p>
+        </w:tc>
+        <w:tc>
+          <w:tcPr>
+            <w:tcW w:type="dxa" w:w="2268"/>
+            <w:shd w:val="clear" w:color="auto" w:fill="F7F4EF"/>
             <w:tcBorders>
               <w:top w:val="single" w:sz="4" w:color="E2DBCF"/>
               <w:left w:val="single" w:sz="4" w:color="E2DBCF"/>
@@ -4138,13 +4163,15 @@
                 <w:color w:val="1F1D1A"/>
                 <w:sz w:val="19"/>
               </w:rPr>
-              <w:t>12</w:t>
-            </w:r>
-          </w:p>
-        </w:tc>
-        <w:tc>
-          <w:tcPr>
-            <w:tcW w:type="dxa" w:w="5783"/>
+              <w:t>видео</w:t>
+            </w:r>
+          </w:p>
+        </w:tc>
+      </w:tr>
+      <w:tr>
+        <w:tc>
+          <w:tcPr>
+            <w:tcW w:type="dxa" w:w="567"/>
             <w:tcBorders>
               <w:top w:val="single" w:sz="4" w:color="E2DBCF"/>
               <w:left w:val="single" w:sz="4" w:color="E2DBCF"/>
@@ -4170,13 +4197,13 @@
                 <w:color w:val="1F1D1A"/>
                 <w:sz w:val="19"/>
               </w:rPr>
-              <w:t>Чертежи и 3D-модели</w:t>
-            </w:r>
-          </w:p>
-        </w:tc>
-        <w:tc>
-          <w:tcPr>
-            <w:tcW w:type="dxa" w:w="2268"/>
+              <w:t>19</w:t>
+            </w:r>
+          </w:p>
+        </w:tc>
+        <w:tc>
+          <w:tcPr>
+            <w:tcW w:type="dxa" w:w="907"/>
             <w:tcBorders>
               <w:top w:val="single" w:sz="4" w:color="E2DBCF"/>
               <w:left w:val="single" w:sz="4" w:color="E2DBCF"/>
@@ -4202,16 +4229,13 @@
                 <w:color w:val="1F1D1A"/>
                 <w:sz w:val="19"/>
               </w:rPr>
-              <w:t>видео, скриншот</w:t>
-            </w:r>
-          </w:p>
-        </w:tc>
-      </w:tr>
-      <w:tr>
-        <w:tc>
-          <w:tcPr>
-            <w:tcW w:type="dxa" w:w="567"/>
-            <w:shd w:val="clear" w:color="auto" w:fill="F7F4EF"/>
+              <w:t>7</w:t>
+            </w:r>
+          </w:p>
+        </w:tc>
+        <w:tc>
+          <w:tcPr>
+            <w:tcW w:type="dxa" w:w="680"/>
             <w:tcBorders>
               <w:top w:val="single" w:sz="4" w:color="E2DBCF"/>
               <w:left w:val="single" w:sz="4" w:color="E2DBCF"/>
@@ -4237,14 +4261,13 @@
                 <w:color w:val="1F1D1A"/>
                 <w:sz w:val="19"/>
               </w:rPr>
-              <w:t>24</w:t>
-            </w:r>
-          </w:p>
-        </w:tc>
-        <w:tc>
-          <w:tcPr>
-            <w:tcW w:type="dxa" w:w="907"/>
-            <w:shd w:val="clear" w:color="auto" w:fill="F7F4EF"/>
+              <w:t>Пн</w:t>
+            </w:r>
+          </w:p>
+        </w:tc>
+        <w:tc>
+          <w:tcPr>
+            <w:tcW w:type="dxa" w:w="5102"/>
             <w:tcBorders>
               <w:top w:val="single" w:sz="4" w:color="E2DBCF"/>
               <w:left w:val="single" w:sz="4" w:color="E2DBCF"/>
@@ -4270,14 +4293,13 @@
                 <w:color w:val="1F1D1A"/>
                 <w:sz w:val="19"/>
               </w:rPr>
-              <w:t>12</w:t>
-            </w:r>
-          </w:p>
-        </w:tc>
-        <w:tc>
-          <w:tcPr>
-            <w:tcW w:type="dxa" w:w="5783"/>
-            <w:shd w:val="clear" w:color="auto" w:fill="F7F4EF"/>
+              <w:t>Chat или Code: где работать</w:t>
+            </w:r>
+          </w:p>
+        </w:tc>
+        <w:tc>
+          <w:tcPr>
+            <w:tcW w:type="dxa" w:w="2268"/>
             <w:tcBorders>
               <w:top w:val="single" w:sz="4" w:color="E2DBCF"/>
               <w:left w:val="single" w:sz="4" w:color="E2DBCF"/>
@@ -4303,13 +4325,15 @@
                 <w:color w:val="1F1D1A"/>
                 <w:sz w:val="19"/>
               </w:rPr>
-              <w:t>Пакетная обработка и перевод документации</w:t>
-            </w:r>
-          </w:p>
-        </w:tc>
-        <w:tc>
-          <w:tcPr>
-            <w:tcW w:type="dxa" w:w="2268"/>
+              <w:t>схема</w:t>
+            </w:r>
+          </w:p>
+        </w:tc>
+      </w:tr>
+      <w:tr>
+        <w:tc>
+          <w:tcPr>
+            <w:tcW w:type="dxa" w:w="567"/>
             <w:shd w:val="clear" w:color="auto" w:fill="F7F4EF"/>
             <w:tcBorders>
               <w:top w:val="single" w:sz="4" w:color="E2DBCF"/>
@@ -4336,15 +4360,14 @@
                 <w:color w:val="1F1D1A"/>
                 <w:sz w:val="19"/>
               </w:rPr>
-              <w:t>видео</w:t>
-            </w:r>
-          </w:p>
-        </w:tc>
-      </w:tr>
-      <w:tr>
-        <w:tc>
-          <w:tcPr>
-            <w:tcW w:type="dxa" w:w="567"/>
+              <w:t>20</w:t>
+            </w:r>
+          </w:p>
+        </w:tc>
+        <w:tc>
+          <w:tcPr>
+            <w:tcW w:type="dxa" w:w="907"/>
+            <w:shd w:val="clear" w:color="auto" w:fill="F7F4EF"/>
             <w:tcBorders>
               <w:top w:val="single" w:sz="4" w:color="E2DBCF"/>
               <w:left w:val="single" w:sz="4" w:color="E2DBCF"/>
@@ -4370,13 +4393,14 @@
                 <w:color w:val="1F1D1A"/>
                 <w:sz w:val="19"/>
               </w:rPr>
-              <w:t>25</w:t>
-            </w:r>
-          </w:p>
-        </w:tc>
-        <w:tc>
-          <w:tcPr>
-            <w:tcW w:type="dxa" w:w="907"/>
+              <w:t>7</w:t>
+            </w:r>
+          </w:p>
+        </w:tc>
+        <w:tc>
+          <w:tcPr>
+            <w:tcW w:type="dxa" w:w="680"/>
+            <w:shd w:val="clear" w:color="auto" w:fill="F7F4EF"/>
             <w:tcBorders>
               <w:top w:val="single" w:sz="4" w:color="E2DBCF"/>
               <w:left w:val="single" w:sz="4" w:color="E2DBCF"/>
@@ -4402,13 +4426,14 @@
                 <w:color w:val="1F1D1A"/>
                 <w:sz w:val="19"/>
               </w:rPr>
-              <w:t>13</w:t>
-            </w:r>
-          </w:p>
-        </w:tc>
-        <w:tc>
-          <w:tcPr>
-            <w:tcW w:type="dxa" w:w="5783"/>
+              <w:t>Ср</w:t>
+            </w:r>
+          </w:p>
+        </w:tc>
+        <w:tc>
+          <w:tcPr>
+            <w:tcW w:type="dxa" w:w="5102"/>
+            <w:shd w:val="clear" w:color="auto" w:fill="F7F4EF"/>
             <w:tcBorders>
               <w:top w:val="single" w:sz="4" w:color="E2DBCF"/>
               <w:left w:val="single" w:sz="4" w:color="E2DBCF"/>
@@ -4434,13 +4459,14 @@
                 <w:color w:val="1F1D1A"/>
                 <w:sz w:val="19"/>
               </w:rPr>
-              <w:t>Память проекта: файл CLAUDE.md</w:t>
+              <w:t>Первый запуск Code</w:t>
             </w:r>
           </w:p>
         </w:tc>
         <w:tc>
           <w:tcPr>
             <w:tcW w:type="dxa" w:w="2268"/>
+            <w:shd w:val="clear" w:color="auto" w:fill="F7F4EF"/>
             <w:tcBorders>
               <w:top w:val="single" w:sz="4" w:color="E2DBCF"/>
               <w:left w:val="single" w:sz="4" w:color="E2DBCF"/>
@@ -4466,7 +4492,7 @@
                 <w:color w:val="1F1D1A"/>
                 <w:sz w:val="19"/>
               </w:rPr>
-              <w:t>схема</w:t>
+              <w:t>видео, скриншот</w:t>
             </w:r>
           </w:p>
         </w:tc>
@@ -4475,7 +4501,6 @@
         <w:tc>
           <w:tcPr>
             <w:tcW w:type="dxa" w:w="567"/>
-            <w:shd w:val="clear" w:color="auto" w:fill="F7F4EF"/>
             <w:tcBorders>
               <w:top w:val="single" w:sz="4" w:color="E2DBCF"/>
               <w:left w:val="single" w:sz="4" w:color="E2DBCF"/>
@@ -4501,14 +4526,13 @@
                 <w:color w:val="1F1D1A"/>
                 <w:sz w:val="19"/>
               </w:rPr>
-              <w:t>26</w:t>
+              <w:t>21</w:t>
             </w:r>
           </w:p>
         </w:tc>
         <w:tc>
           <w:tcPr>
             <w:tcW w:type="dxa" w:w="907"/>
-            <w:shd w:val="clear" w:color="auto" w:fill="F7F4EF"/>
             <w:tcBorders>
               <w:top w:val="single" w:sz="4" w:color="E2DBCF"/>
               <w:left w:val="single" w:sz="4" w:color="E2DBCF"/>
@@ -4534,14 +4558,13 @@
                 <w:color w:val="1F1D1A"/>
                 <w:sz w:val="19"/>
               </w:rPr>
-              <w:t>13</w:t>
-            </w:r>
-          </w:p>
-        </w:tc>
-        <w:tc>
-          <w:tcPr>
-            <w:tcW w:type="dxa" w:w="5783"/>
-            <w:shd w:val="clear" w:color="auto" w:fill="F7F4EF"/>
+              <w:t>7</w:t>
+            </w:r>
+          </w:p>
+        </w:tc>
+        <w:tc>
+          <w:tcPr>
+            <w:tcW w:type="dxa" w:w="680"/>
             <w:tcBorders>
               <w:top w:val="single" w:sz="4" w:color="E2DBCF"/>
               <w:left w:val="single" w:sz="4" w:color="E2DBCF"/>
@@ -4567,14 +4590,13 @@
                 <w:color w:val="1F1D1A"/>
                 <w:sz w:val="19"/>
               </w:rPr>
-              <w:t>Навыки: упаковываем повторяющиеся задачи</w:t>
-            </w:r>
-          </w:p>
-        </w:tc>
-        <w:tc>
-          <w:tcPr>
-            <w:tcW w:type="dxa" w:w="2268"/>
-            <w:shd w:val="clear" w:color="auto" w:fill="F7F4EF"/>
+              <w:t>Пт</w:t>
+            </w:r>
+          </w:p>
+        </w:tc>
+        <w:tc>
+          <w:tcPr>
+            <w:tcW w:type="dxa" w:w="5102"/>
             <w:tcBorders>
               <w:top w:val="single" w:sz="4" w:color="E2DBCF"/>
               <w:left w:val="single" w:sz="4" w:color="E2DBCF"/>
@@ -4600,15 +4622,13 @@
                 <w:color w:val="1F1D1A"/>
                 <w:sz w:val="19"/>
               </w:rPr>
-              <w:t>видео</w:t>
-            </w:r>
-          </w:p>
-        </w:tc>
-      </w:tr>
-      <w:tr>
-        <w:tc>
-          <w:tcPr>
-            <w:tcW w:type="dxa" w:w="567"/>
+              <w:t>Правка документов прямо в папке</w:t>
+            </w:r>
+          </w:p>
+        </w:tc>
+        <w:tc>
+          <w:tcPr>
+            <w:tcW w:type="dxa" w:w="2268"/>
             <w:tcBorders>
               <w:top w:val="single" w:sz="4" w:color="E2DBCF"/>
               <w:left w:val="single" w:sz="4" w:color="E2DBCF"/>
@@ -4634,13 +4654,16 @@
                 <w:color w:val="1F1D1A"/>
                 <w:sz w:val="19"/>
               </w:rPr>
-              <w:t>27</w:t>
-            </w:r>
-          </w:p>
-        </w:tc>
-        <w:tc>
-          <w:tcPr>
-            <w:tcW w:type="dxa" w:w="907"/>
+              <w:t>видео</w:t>
+            </w:r>
+          </w:p>
+        </w:tc>
+      </w:tr>
+      <w:tr>
+        <w:tc>
+          <w:tcPr>
+            <w:tcW w:type="dxa" w:w="567"/>
+            <w:shd w:val="clear" w:color="auto" w:fill="F7F4EF"/>
             <w:tcBorders>
               <w:top w:val="single" w:sz="4" w:color="E2DBCF"/>
               <w:left w:val="single" w:sz="4" w:color="E2DBCF"/>
@@ -4666,13 +4689,14 @@
                 <w:color w:val="1F1D1A"/>
                 <w:sz w:val="19"/>
               </w:rPr>
-              <w:t>14</w:t>
-            </w:r>
-          </w:p>
-        </w:tc>
-        <w:tc>
-          <w:tcPr>
-            <w:tcW w:type="dxa" w:w="5783"/>
+              <w:t>22</w:t>
+            </w:r>
+          </w:p>
+        </w:tc>
+        <w:tc>
+          <w:tcPr>
+            <w:tcW w:type="dxa" w:w="907"/>
+            <w:shd w:val="clear" w:color="auto" w:fill="F7F4EF"/>
             <w:tcBorders>
               <w:top w:val="single" w:sz="4" w:color="E2DBCF"/>
               <w:left w:val="single" w:sz="4" w:color="E2DBCF"/>
@@ -4698,13 +4722,14 @@
                 <w:color w:val="1F1D1A"/>
                 <w:sz w:val="19"/>
               </w:rPr>
-              <w:t>Подключения к сервисам</w:t>
-            </w:r>
-          </w:p>
-        </w:tc>
-        <w:tc>
-          <w:tcPr>
-            <w:tcW w:type="dxa" w:w="2268"/>
+              <w:t>8</w:t>
+            </w:r>
+          </w:p>
+        </w:tc>
+        <w:tc>
+          <w:tcPr>
+            <w:tcW w:type="dxa" w:w="680"/>
+            <w:shd w:val="clear" w:color="auto" w:fill="F7F4EF"/>
             <w:tcBorders>
               <w:top w:val="single" w:sz="4" w:color="E2DBCF"/>
               <w:left w:val="single" w:sz="4" w:color="E2DBCF"/>
@@ -4730,15 +4755,13 @@
                 <w:color w:val="1F1D1A"/>
                 <w:sz w:val="19"/>
               </w:rPr>
-              <w:t>схема, скриншот</w:t>
-            </w:r>
-          </w:p>
-        </w:tc>
-      </w:tr>
-      <w:tr>
-        <w:tc>
-          <w:tcPr>
-            <w:tcW w:type="dxa" w:w="567"/>
+              <w:t>Пн</w:t>
+            </w:r>
+          </w:p>
+        </w:tc>
+        <w:tc>
+          <w:tcPr>
+            <w:tcW w:type="dxa" w:w="5102"/>
             <w:shd w:val="clear" w:color="auto" w:fill="F7F4EF"/>
             <w:tcBorders>
               <w:top w:val="single" w:sz="4" w:color="E2DBCF"/>
@@ -4765,13 +4788,13 @@
                 <w:color w:val="1F1D1A"/>
                 <w:sz w:val="19"/>
               </w:rPr>
-              <w:t>28</w:t>
-            </w:r>
-          </w:p>
-        </w:tc>
-        <w:tc>
-          <w:tcPr>
-            <w:tcW w:type="dxa" w:w="907"/>
+              <w:t>Расчёты кодом</w:t>
+            </w:r>
+          </w:p>
+        </w:tc>
+        <w:tc>
+          <w:tcPr>
+            <w:tcW w:type="dxa" w:w="2268"/>
             <w:shd w:val="clear" w:color="auto" w:fill="F7F4EF"/>
             <w:tcBorders>
               <w:top w:val="single" w:sz="4" w:color="E2DBCF"/>
@@ -4798,14 +4821,15 @@
                 <w:color w:val="1F1D1A"/>
                 <w:sz w:val="19"/>
               </w:rPr>
-              <w:t>14</w:t>
-            </w:r>
-          </w:p>
-        </w:tc>
-        <w:tc>
-          <w:tcPr>
-            <w:tcW w:type="dxa" w:w="5783"/>
-            <w:shd w:val="clear" w:color="auto" w:fill="F7F4EF"/>
+              <w:t>видео</w:t>
+            </w:r>
+          </w:p>
+        </w:tc>
+      </w:tr>
+      <w:tr>
+        <w:tc>
+          <w:tcPr>
+            <w:tcW w:type="dxa" w:w="567"/>
             <w:tcBorders>
               <w:top w:val="single" w:sz="4" w:color="E2DBCF"/>
               <w:left w:val="single" w:sz="4" w:color="E2DBCF"/>
@@ -4831,14 +4855,13 @@
                 <w:color w:val="1F1D1A"/>
                 <w:sz w:val="19"/>
               </w:rPr>
-              <w:t>Задачи по расписанию</w:t>
-            </w:r>
-          </w:p>
-        </w:tc>
-        <w:tc>
-          <w:tcPr>
-            <w:tcW w:type="dxa" w:w="2268"/>
-            <w:shd w:val="clear" w:color="auto" w:fill="F7F4EF"/>
+              <w:t>23</w:t>
+            </w:r>
+          </w:p>
+        </w:tc>
+        <w:tc>
+          <w:tcPr>
+            <w:tcW w:type="dxa" w:w="907"/>
             <w:tcBorders>
               <w:top w:val="single" w:sz="4" w:color="E2DBCF"/>
               <w:left w:val="single" w:sz="4" w:color="E2DBCF"/>
@@ -4864,15 +4887,13 @@
                 <w:color w:val="1F1D1A"/>
                 <w:sz w:val="19"/>
               </w:rPr>
-              <w:t>скриншот</w:t>
-            </w:r>
-          </w:p>
-        </w:tc>
-      </w:tr>
-      <w:tr>
-        <w:tc>
-          <w:tcPr>
-            <w:tcW w:type="dxa" w:w="567"/>
+              <w:t>8</w:t>
+            </w:r>
+          </w:p>
+        </w:tc>
+        <w:tc>
+          <w:tcPr>
+            <w:tcW w:type="dxa" w:w="680"/>
             <w:tcBorders>
               <w:top w:val="single" w:sz="4" w:color="E2DBCF"/>
               <w:left w:val="single" w:sz="4" w:color="E2DBCF"/>
@@ -4898,13 +4919,13 @@
                 <w:color w:val="1F1D1A"/>
                 <w:sz w:val="19"/>
               </w:rPr>
-              <w:t>29</w:t>
-            </w:r>
-          </w:p>
-        </w:tc>
-        <w:tc>
-          <w:tcPr>
-            <w:tcW w:type="dxa" w:w="907"/>
+              <w:t>Ср</w:t>
+            </w:r>
+          </w:p>
+        </w:tc>
+        <w:tc>
+          <w:tcPr>
+            <w:tcW w:type="dxa" w:w="5102"/>
             <w:tcBorders>
               <w:top w:val="single" w:sz="4" w:color="E2DBCF"/>
               <w:left w:val="single" w:sz="4" w:color="E2DBCF"/>
@@ -4930,13 +4951,13 @@
                 <w:color w:val="1F1D1A"/>
                 <w:sz w:val="19"/>
               </w:rPr>
-              <w:t>15</w:t>
-            </w:r>
-          </w:p>
-        </w:tc>
-        <w:tc>
-          <w:tcPr>
-            <w:tcW w:type="dxa" w:w="5783"/>
+              <w:t>Чертежи и 3D-модели</w:t>
+            </w:r>
+          </w:p>
+        </w:tc>
+        <w:tc>
+          <w:tcPr>
+            <w:tcW w:type="dxa" w:w="2268"/>
             <w:tcBorders>
               <w:top w:val="single" w:sz="4" w:color="E2DBCF"/>
               <w:left w:val="single" w:sz="4" w:color="E2DBCF"/>
@@ -4962,13 +4983,16 @@
                 <w:color w:val="1F1D1A"/>
                 <w:sz w:val="19"/>
               </w:rPr>
-              <w:t>Что такое агент и субагент</w:t>
-            </w:r>
-          </w:p>
-        </w:tc>
-        <w:tc>
-          <w:tcPr>
-            <w:tcW w:type="dxa" w:w="2268"/>
+              <w:t>видео, скриншот</w:t>
+            </w:r>
+          </w:p>
+        </w:tc>
+      </w:tr>
+      <w:tr>
+        <w:tc>
+          <w:tcPr>
+            <w:tcW w:type="dxa" w:w="567"/>
+            <w:shd w:val="clear" w:color="auto" w:fill="F7F4EF"/>
             <w:tcBorders>
               <w:top w:val="single" w:sz="4" w:color="E2DBCF"/>
               <w:left w:val="single" w:sz="4" w:color="E2DBCF"/>
@@ -4994,15 +5018,13 @@
                 <w:color w:val="1F1D1A"/>
                 <w:sz w:val="19"/>
               </w:rPr>
-              <w:t>схема</w:t>
-            </w:r>
-          </w:p>
-        </w:tc>
-      </w:tr>
-      <w:tr>
-        <w:tc>
-          <w:tcPr>
-            <w:tcW w:type="dxa" w:w="567"/>
+              <w:t>24</w:t>
+            </w:r>
+          </w:p>
+        </w:tc>
+        <w:tc>
+          <w:tcPr>
+            <w:tcW w:type="dxa" w:w="907"/>
             <w:shd w:val="clear" w:color="auto" w:fill="F7F4EF"/>
             <w:tcBorders>
               <w:top w:val="single" w:sz="4" w:color="E2DBCF"/>
@@ -5029,13 +5051,13 @@
                 <w:color w:val="1F1D1A"/>
                 <w:sz w:val="19"/>
               </w:rPr>
-              <w:t>30</w:t>
-            </w:r>
-          </w:p>
-        </w:tc>
-        <w:tc>
-          <w:tcPr>
-            <w:tcW w:type="dxa" w:w="907"/>
+              <w:t>8</w:t>
+            </w:r>
+          </w:p>
+        </w:tc>
+        <w:tc>
+          <w:tcPr>
+            <w:tcW w:type="dxa" w:w="680"/>
             <w:shd w:val="clear" w:color="auto" w:fill="F7F4EF"/>
             <w:tcBorders>
               <w:top w:val="single" w:sz="4" w:color="E2DBCF"/>
@@ -5062,13 +5084,13 @@
                 <w:color w:val="1F1D1A"/>
                 <w:sz w:val="19"/>
               </w:rPr>
-              <w:t>15</w:t>
-            </w:r>
-          </w:p>
-        </w:tc>
-        <w:tc>
-          <w:tcPr>
-            <w:tcW w:type="dxa" w:w="5783"/>
+              <w:t>Пт</w:t>
+            </w:r>
+          </w:p>
+        </w:tc>
+        <w:tc>
+          <w:tcPr>
+            <w:tcW w:type="dxa" w:w="5102"/>
             <w:shd w:val="clear" w:color="auto" w:fill="F7F4EF"/>
             <w:tcBorders>
               <w:top w:val="single" w:sz="4" w:color="E2DBCF"/>
@@ -5095,7 +5117,7 @@
                 <w:color w:val="1F1D1A"/>
                 <w:sz w:val="19"/>
               </w:rPr>
-              <w:t>Команда агентов: тимлид и специалисты</w:t>
+              <w:t>Пакетная обработка и перевод документации</w:t>
             </w:r>
           </w:p>
         </w:tc>
@@ -5128,7 +5150,7 @@
                 <w:color w:val="1F1D1A"/>
                 <w:sz w:val="19"/>
               </w:rPr>
-              <w:t>схема</w:t>
+              <w:t>видео</w:t>
             </w:r>
           </w:p>
         </w:tc>
@@ -5162,7 +5184,7 @@
                 <w:color w:val="1F1D1A"/>
                 <w:sz w:val="19"/>
               </w:rPr>
-              <w:t>31</w:t>
+              <w:t>25</w:t>
             </w:r>
           </w:p>
         </w:tc>
@@ -5194,13 +5216,13 @@
                 <w:color w:val="1F1D1A"/>
                 <w:sz w:val="19"/>
               </w:rPr>
-              <w:t>16</w:t>
-            </w:r>
-          </w:p>
-        </w:tc>
-        <w:tc>
-          <w:tcPr>
-            <w:tcW w:type="dxa" w:w="5783"/>
+              <w:t>9</w:t>
+            </w:r>
+          </w:p>
+        </w:tc>
+        <w:tc>
+          <w:tcPr>
+            <w:tcW w:type="dxa" w:w="680"/>
             <w:tcBorders>
               <w:top w:val="single" w:sz="4" w:color="E2DBCF"/>
               <w:left w:val="single" w:sz="4" w:color="E2DBCF"/>
@@ -5226,13 +5248,13 @@
                 <w:color w:val="1F1D1A"/>
                 <w:sz w:val="19"/>
               </w:rPr>
-              <w:t>Контроль качества на «заводе»</w:t>
-            </w:r>
-          </w:p>
-        </w:tc>
-        <w:tc>
-          <w:tcPr>
-            <w:tcW w:type="dxa" w:w="2268"/>
+              <w:t>Пн</w:t>
+            </w:r>
+          </w:p>
+        </w:tc>
+        <w:tc>
+          <w:tcPr>
+            <w:tcW w:type="dxa" w:w="5102"/>
             <w:tcBorders>
               <w:top w:val="single" w:sz="4" w:color="E2DBCF"/>
               <w:left w:val="single" w:sz="4" w:color="E2DBCF"/>
@@ -5258,16 +5280,13 @@
                 <w:color w:val="1F1D1A"/>
                 <w:sz w:val="19"/>
               </w:rPr>
-              <w:t>схема</w:t>
-            </w:r>
-          </w:p>
-        </w:tc>
-      </w:tr>
-      <w:tr>
-        <w:tc>
-          <w:tcPr>
-            <w:tcW w:type="dxa" w:w="567"/>
-            <w:shd w:val="clear" w:color="auto" w:fill="F7F4EF"/>
+              <w:t>Память проекта: файл CLAUDE.md</w:t>
+            </w:r>
+          </w:p>
+        </w:tc>
+        <w:tc>
+          <w:tcPr>
+            <w:tcW w:type="dxa" w:w="2268"/>
             <w:tcBorders>
               <w:top w:val="single" w:sz="4" w:color="E2DBCF"/>
               <w:left w:val="single" w:sz="4" w:color="E2DBCF"/>
@@ -5293,13 +5312,15 @@
                 <w:color w:val="1F1D1A"/>
                 <w:sz w:val="19"/>
               </w:rPr>
-              <w:t>32</w:t>
-            </w:r>
-          </w:p>
-        </w:tc>
-        <w:tc>
-          <w:tcPr>
-            <w:tcW w:type="dxa" w:w="907"/>
+              <w:t>схема</w:t>
+            </w:r>
+          </w:p>
+        </w:tc>
+      </w:tr>
+      <w:tr>
+        <w:tc>
+          <w:tcPr>
+            <w:tcW w:type="dxa" w:w="567"/>
             <w:shd w:val="clear" w:color="auto" w:fill="F7F4EF"/>
             <w:tcBorders>
               <w:top w:val="single" w:sz="4" w:color="E2DBCF"/>
@@ -5326,13 +5347,1066 @@
                 <w:color w:val="1F1D1A"/>
                 <w:sz w:val="19"/>
               </w:rPr>
-              <w:t>16</w:t>
-            </w:r>
-          </w:p>
-        </w:tc>
-        <w:tc>
-          <w:tcPr>
-            <w:tcW w:type="dxa" w:w="5783"/>
+              <w:t>26</w:t>
+            </w:r>
+          </w:p>
+        </w:tc>
+        <w:tc>
+          <w:tcPr>
+            <w:tcW w:type="dxa" w:w="907"/>
+            <w:shd w:val="clear" w:color="auto" w:fill="F7F4EF"/>
+            <w:tcBorders>
+              <w:top w:val="single" w:sz="4" w:color="E2DBCF"/>
+              <w:left w:val="single" w:sz="4" w:color="E2DBCF"/>
+              <w:bottom w:val="single" w:sz="4" w:color="E2DBCF"/>
+              <w:right w:val="single" w:sz="4" w:color="E2DBCF"/>
+            </w:tcBorders>
+            <w:tcMar>
+              <w:top w:w="70" w:type="dxa"/>
+              <w:bottom w:w="70" w:type="dxa"/>
+              <w:start w:w="120" w:type="dxa"/>
+              <w:end w:w="120" w:type="dxa"/>
+            </w:tcMar>
+          </w:tcPr>
+          <w:p>
+            <w:pPr>
+              <w:spacing w:after="0" w:line="264" w:lineRule="auto"/>
+            </w:pPr>
+            <w:r>
+              <w:rPr>
+                <w:rFonts w:ascii="Calibri" w:hAnsi="Calibri"/>
+                <w:b w:val="0"/>
+                <w:i w:val="0"/>
+                <w:color w:val="1F1D1A"/>
+                <w:sz w:val="19"/>
+              </w:rPr>
+              <w:t>9</w:t>
+            </w:r>
+          </w:p>
+        </w:tc>
+        <w:tc>
+          <w:tcPr>
+            <w:tcW w:type="dxa" w:w="680"/>
+            <w:shd w:val="clear" w:color="auto" w:fill="F7F4EF"/>
+            <w:tcBorders>
+              <w:top w:val="single" w:sz="4" w:color="E2DBCF"/>
+              <w:left w:val="single" w:sz="4" w:color="E2DBCF"/>
+              <w:bottom w:val="single" w:sz="4" w:color="E2DBCF"/>
+              <w:right w:val="single" w:sz="4" w:color="E2DBCF"/>
+            </w:tcBorders>
+            <w:tcMar>
+              <w:top w:w="70" w:type="dxa"/>
+              <w:bottom w:w="70" w:type="dxa"/>
+              <w:start w:w="120" w:type="dxa"/>
+              <w:end w:w="120" w:type="dxa"/>
+            </w:tcMar>
+          </w:tcPr>
+          <w:p>
+            <w:pPr>
+              <w:spacing w:after="0" w:line="264" w:lineRule="auto"/>
+            </w:pPr>
+            <w:r>
+              <w:rPr>
+                <w:rFonts w:ascii="Calibri" w:hAnsi="Calibri"/>
+                <w:b w:val="0"/>
+                <w:i w:val="0"/>
+                <w:color w:val="1F1D1A"/>
+                <w:sz w:val="19"/>
+              </w:rPr>
+              <w:t>Ср</w:t>
+            </w:r>
+          </w:p>
+        </w:tc>
+        <w:tc>
+          <w:tcPr>
+            <w:tcW w:type="dxa" w:w="5102"/>
+            <w:shd w:val="clear" w:color="auto" w:fill="F7F4EF"/>
+            <w:tcBorders>
+              <w:top w:val="single" w:sz="4" w:color="E2DBCF"/>
+              <w:left w:val="single" w:sz="4" w:color="E2DBCF"/>
+              <w:bottom w:val="single" w:sz="4" w:color="E2DBCF"/>
+              <w:right w:val="single" w:sz="4" w:color="E2DBCF"/>
+            </w:tcBorders>
+            <w:tcMar>
+              <w:top w:w="70" w:type="dxa"/>
+              <w:bottom w:w="70" w:type="dxa"/>
+              <w:start w:w="120" w:type="dxa"/>
+              <w:end w:w="120" w:type="dxa"/>
+            </w:tcMar>
+          </w:tcPr>
+          <w:p>
+            <w:pPr>
+              <w:spacing w:after="0" w:line="264" w:lineRule="auto"/>
+            </w:pPr>
+            <w:r>
+              <w:rPr>
+                <w:rFonts w:ascii="Calibri" w:hAnsi="Calibri"/>
+                <w:b w:val="0"/>
+                <w:i w:val="0"/>
+                <w:color w:val="1F1D1A"/>
+                <w:sz w:val="19"/>
+              </w:rPr>
+              <w:t>Навыки: упаковываем повторяющиеся задачи</w:t>
+            </w:r>
+          </w:p>
+        </w:tc>
+        <w:tc>
+          <w:tcPr>
+            <w:tcW w:type="dxa" w:w="2268"/>
+            <w:shd w:val="clear" w:color="auto" w:fill="F7F4EF"/>
+            <w:tcBorders>
+              <w:top w:val="single" w:sz="4" w:color="E2DBCF"/>
+              <w:left w:val="single" w:sz="4" w:color="E2DBCF"/>
+              <w:bottom w:val="single" w:sz="4" w:color="E2DBCF"/>
+              <w:right w:val="single" w:sz="4" w:color="E2DBCF"/>
+            </w:tcBorders>
+            <w:tcMar>
+              <w:top w:w="70" w:type="dxa"/>
+              <w:bottom w:w="70" w:type="dxa"/>
+              <w:start w:w="120" w:type="dxa"/>
+              <w:end w:w="120" w:type="dxa"/>
+            </w:tcMar>
+          </w:tcPr>
+          <w:p>
+            <w:pPr>
+              <w:spacing w:after="0" w:line="264" w:lineRule="auto"/>
+            </w:pPr>
+            <w:r>
+              <w:rPr>
+                <w:rFonts w:ascii="Calibri" w:hAnsi="Calibri"/>
+                <w:b w:val="0"/>
+                <w:i w:val="0"/>
+                <w:color w:val="1F1D1A"/>
+                <w:sz w:val="19"/>
+              </w:rPr>
+              <w:t>видео</w:t>
+            </w:r>
+          </w:p>
+        </w:tc>
+      </w:tr>
+      <w:tr>
+        <w:tc>
+          <w:tcPr>
+            <w:tcW w:type="dxa" w:w="567"/>
+            <w:tcBorders>
+              <w:top w:val="single" w:sz="4" w:color="E2DBCF"/>
+              <w:left w:val="single" w:sz="4" w:color="E2DBCF"/>
+              <w:bottom w:val="single" w:sz="4" w:color="E2DBCF"/>
+              <w:right w:val="single" w:sz="4" w:color="E2DBCF"/>
+            </w:tcBorders>
+            <w:tcMar>
+              <w:top w:w="70" w:type="dxa"/>
+              <w:bottom w:w="70" w:type="dxa"/>
+              <w:start w:w="120" w:type="dxa"/>
+              <w:end w:w="120" w:type="dxa"/>
+            </w:tcMar>
+          </w:tcPr>
+          <w:p>
+            <w:pPr>
+              <w:spacing w:after="0" w:line="264" w:lineRule="auto"/>
+            </w:pPr>
+            <w:r>
+              <w:rPr>
+                <w:rFonts w:ascii="Calibri" w:hAnsi="Calibri"/>
+                <w:b w:val="0"/>
+                <w:i w:val="0"/>
+                <w:color w:val="1F1D1A"/>
+                <w:sz w:val="19"/>
+              </w:rPr>
+              <w:t>27</w:t>
+            </w:r>
+          </w:p>
+        </w:tc>
+        <w:tc>
+          <w:tcPr>
+            <w:tcW w:type="dxa" w:w="907"/>
+            <w:tcBorders>
+              <w:top w:val="single" w:sz="4" w:color="E2DBCF"/>
+              <w:left w:val="single" w:sz="4" w:color="E2DBCF"/>
+              <w:bottom w:val="single" w:sz="4" w:color="E2DBCF"/>
+              <w:right w:val="single" w:sz="4" w:color="E2DBCF"/>
+            </w:tcBorders>
+            <w:tcMar>
+              <w:top w:w="70" w:type="dxa"/>
+              <w:bottom w:w="70" w:type="dxa"/>
+              <w:start w:w="120" w:type="dxa"/>
+              <w:end w:w="120" w:type="dxa"/>
+            </w:tcMar>
+          </w:tcPr>
+          <w:p>
+            <w:pPr>
+              <w:spacing w:after="0" w:line="264" w:lineRule="auto"/>
+            </w:pPr>
+            <w:r>
+              <w:rPr>
+                <w:rFonts w:ascii="Calibri" w:hAnsi="Calibri"/>
+                <w:b w:val="0"/>
+                <w:i w:val="0"/>
+                <w:color w:val="1F1D1A"/>
+                <w:sz w:val="19"/>
+              </w:rPr>
+              <w:t>9</w:t>
+            </w:r>
+          </w:p>
+        </w:tc>
+        <w:tc>
+          <w:tcPr>
+            <w:tcW w:type="dxa" w:w="680"/>
+            <w:tcBorders>
+              <w:top w:val="single" w:sz="4" w:color="E2DBCF"/>
+              <w:left w:val="single" w:sz="4" w:color="E2DBCF"/>
+              <w:bottom w:val="single" w:sz="4" w:color="E2DBCF"/>
+              <w:right w:val="single" w:sz="4" w:color="E2DBCF"/>
+            </w:tcBorders>
+            <w:tcMar>
+              <w:top w:w="70" w:type="dxa"/>
+              <w:bottom w:w="70" w:type="dxa"/>
+              <w:start w:w="120" w:type="dxa"/>
+              <w:end w:w="120" w:type="dxa"/>
+            </w:tcMar>
+          </w:tcPr>
+          <w:p>
+            <w:pPr>
+              <w:spacing w:after="0" w:line="264" w:lineRule="auto"/>
+            </w:pPr>
+            <w:r>
+              <w:rPr>
+                <w:rFonts w:ascii="Calibri" w:hAnsi="Calibri"/>
+                <w:b w:val="0"/>
+                <w:i w:val="0"/>
+                <w:color w:val="1F1D1A"/>
+                <w:sz w:val="19"/>
+              </w:rPr>
+              <w:t>Пт</w:t>
+            </w:r>
+          </w:p>
+        </w:tc>
+        <w:tc>
+          <w:tcPr>
+            <w:tcW w:type="dxa" w:w="5102"/>
+            <w:tcBorders>
+              <w:top w:val="single" w:sz="4" w:color="E2DBCF"/>
+              <w:left w:val="single" w:sz="4" w:color="E2DBCF"/>
+              <w:bottom w:val="single" w:sz="4" w:color="E2DBCF"/>
+              <w:right w:val="single" w:sz="4" w:color="E2DBCF"/>
+            </w:tcBorders>
+            <w:tcMar>
+              <w:top w:w="70" w:type="dxa"/>
+              <w:bottom w:w="70" w:type="dxa"/>
+              <w:start w:w="120" w:type="dxa"/>
+              <w:end w:w="120" w:type="dxa"/>
+            </w:tcMar>
+          </w:tcPr>
+          <w:p>
+            <w:pPr>
+              <w:spacing w:after="0" w:line="264" w:lineRule="auto"/>
+            </w:pPr>
+            <w:r>
+              <w:rPr>
+                <w:rFonts w:ascii="Calibri" w:hAnsi="Calibri"/>
+                <w:b w:val="0"/>
+                <w:i w:val="0"/>
+                <w:color w:val="1F1D1A"/>
+                <w:sz w:val="19"/>
+              </w:rPr>
+              <w:t>Подключения к сервисам</w:t>
+            </w:r>
+          </w:p>
+        </w:tc>
+        <w:tc>
+          <w:tcPr>
+            <w:tcW w:type="dxa" w:w="2268"/>
+            <w:tcBorders>
+              <w:top w:val="single" w:sz="4" w:color="E2DBCF"/>
+              <w:left w:val="single" w:sz="4" w:color="E2DBCF"/>
+              <w:bottom w:val="single" w:sz="4" w:color="E2DBCF"/>
+              <w:right w:val="single" w:sz="4" w:color="E2DBCF"/>
+            </w:tcBorders>
+            <w:tcMar>
+              <w:top w:w="70" w:type="dxa"/>
+              <w:bottom w:w="70" w:type="dxa"/>
+              <w:start w:w="120" w:type="dxa"/>
+              <w:end w:w="120" w:type="dxa"/>
+            </w:tcMar>
+          </w:tcPr>
+          <w:p>
+            <w:pPr>
+              <w:spacing w:after="0" w:line="264" w:lineRule="auto"/>
+            </w:pPr>
+            <w:r>
+              <w:rPr>
+                <w:rFonts w:ascii="Calibri" w:hAnsi="Calibri"/>
+                <w:b w:val="0"/>
+                <w:i w:val="0"/>
+                <w:color w:val="1F1D1A"/>
+                <w:sz w:val="19"/>
+              </w:rPr>
+              <w:t>схема, скриншот</w:t>
+            </w:r>
+          </w:p>
+        </w:tc>
+      </w:tr>
+      <w:tr>
+        <w:tc>
+          <w:tcPr>
+            <w:tcW w:type="dxa" w:w="567"/>
+            <w:shd w:val="clear" w:color="auto" w:fill="F7F4EF"/>
+            <w:tcBorders>
+              <w:top w:val="single" w:sz="4" w:color="E2DBCF"/>
+              <w:left w:val="single" w:sz="4" w:color="E2DBCF"/>
+              <w:bottom w:val="single" w:sz="4" w:color="E2DBCF"/>
+              <w:right w:val="single" w:sz="4" w:color="E2DBCF"/>
+            </w:tcBorders>
+            <w:tcMar>
+              <w:top w:w="70" w:type="dxa"/>
+              <w:bottom w:w="70" w:type="dxa"/>
+              <w:start w:w="120" w:type="dxa"/>
+              <w:end w:w="120" w:type="dxa"/>
+            </w:tcMar>
+          </w:tcPr>
+          <w:p>
+            <w:pPr>
+              <w:spacing w:after="0" w:line="264" w:lineRule="auto"/>
+            </w:pPr>
+            <w:r>
+              <w:rPr>
+                <w:rFonts w:ascii="Calibri" w:hAnsi="Calibri"/>
+                <w:b w:val="0"/>
+                <w:i w:val="0"/>
+                <w:color w:val="1F1D1A"/>
+                <w:sz w:val="19"/>
+              </w:rPr>
+              <w:t>28</w:t>
+            </w:r>
+          </w:p>
+        </w:tc>
+        <w:tc>
+          <w:tcPr>
+            <w:tcW w:type="dxa" w:w="907"/>
+            <w:shd w:val="clear" w:color="auto" w:fill="F7F4EF"/>
+            <w:tcBorders>
+              <w:top w:val="single" w:sz="4" w:color="E2DBCF"/>
+              <w:left w:val="single" w:sz="4" w:color="E2DBCF"/>
+              <w:bottom w:val="single" w:sz="4" w:color="E2DBCF"/>
+              <w:right w:val="single" w:sz="4" w:color="E2DBCF"/>
+            </w:tcBorders>
+            <w:tcMar>
+              <w:top w:w="70" w:type="dxa"/>
+              <w:bottom w:w="70" w:type="dxa"/>
+              <w:start w:w="120" w:type="dxa"/>
+              <w:end w:w="120" w:type="dxa"/>
+            </w:tcMar>
+          </w:tcPr>
+          <w:p>
+            <w:pPr>
+              <w:spacing w:after="0" w:line="264" w:lineRule="auto"/>
+            </w:pPr>
+            <w:r>
+              <w:rPr>
+                <w:rFonts w:ascii="Calibri" w:hAnsi="Calibri"/>
+                <w:b w:val="0"/>
+                <w:i w:val="0"/>
+                <w:color w:val="1F1D1A"/>
+                <w:sz w:val="19"/>
+              </w:rPr>
+              <w:t>10</w:t>
+            </w:r>
+          </w:p>
+        </w:tc>
+        <w:tc>
+          <w:tcPr>
+            <w:tcW w:type="dxa" w:w="680"/>
+            <w:shd w:val="clear" w:color="auto" w:fill="F7F4EF"/>
+            <w:tcBorders>
+              <w:top w:val="single" w:sz="4" w:color="E2DBCF"/>
+              <w:left w:val="single" w:sz="4" w:color="E2DBCF"/>
+              <w:bottom w:val="single" w:sz="4" w:color="E2DBCF"/>
+              <w:right w:val="single" w:sz="4" w:color="E2DBCF"/>
+            </w:tcBorders>
+            <w:tcMar>
+              <w:top w:w="70" w:type="dxa"/>
+              <w:bottom w:w="70" w:type="dxa"/>
+              <w:start w:w="120" w:type="dxa"/>
+              <w:end w:w="120" w:type="dxa"/>
+            </w:tcMar>
+          </w:tcPr>
+          <w:p>
+            <w:pPr>
+              <w:spacing w:after="0" w:line="264" w:lineRule="auto"/>
+            </w:pPr>
+            <w:r>
+              <w:rPr>
+                <w:rFonts w:ascii="Calibri" w:hAnsi="Calibri"/>
+                <w:b w:val="0"/>
+                <w:i w:val="0"/>
+                <w:color w:val="1F1D1A"/>
+                <w:sz w:val="19"/>
+              </w:rPr>
+              <w:t>Пн</w:t>
+            </w:r>
+          </w:p>
+        </w:tc>
+        <w:tc>
+          <w:tcPr>
+            <w:tcW w:type="dxa" w:w="5102"/>
+            <w:shd w:val="clear" w:color="auto" w:fill="F7F4EF"/>
+            <w:tcBorders>
+              <w:top w:val="single" w:sz="4" w:color="E2DBCF"/>
+              <w:left w:val="single" w:sz="4" w:color="E2DBCF"/>
+              <w:bottom w:val="single" w:sz="4" w:color="E2DBCF"/>
+              <w:right w:val="single" w:sz="4" w:color="E2DBCF"/>
+            </w:tcBorders>
+            <w:tcMar>
+              <w:top w:w="70" w:type="dxa"/>
+              <w:bottom w:w="70" w:type="dxa"/>
+              <w:start w:w="120" w:type="dxa"/>
+              <w:end w:w="120" w:type="dxa"/>
+            </w:tcMar>
+          </w:tcPr>
+          <w:p>
+            <w:pPr>
+              <w:spacing w:after="0" w:line="264" w:lineRule="auto"/>
+            </w:pPr>
+            <w:r>
+              <w:rPr>
+                <w:rFonts w:ascii="Calibri" w:hAnsi="Calibri"/>
+                <w:b w:val="0"/>
+                <w:i w:val="0"/>
+                <w:color w:val="1F1D1A"/>
+                <w:sz w:val="19"/>
+              </w:rPr>
+              <w:t>Задачи по расписанию</w:t>
+            </w:r>
+          </w:p>
+        </w:tc>
+        <w:tc>
+          <w:tcPr>
+            <w:tcW w:type="dxa" w:w="2268"/>
+            <w:shd w:val="clear" w:color="auto" w:fill="F7F4EF"/>
+            <w:tcBorders>
+              <w:top w:val="single" w:sz="4" w:color="E2DBCF"/>
+              <w:left w:val="single" w:sz="4" w:color="E2DBCF"/>
+              <w:bottom w:val="single" w:sz="4" w:color="E2DBCF"/>
+              <w:right w:val="single" w:sz="4" w:color="E2DBCF"/>
+            </w:tcBorders>
+            <w:tcMar>
+              <w:top w:w="70" w:type="dxa"/>
+              <w:bottom w:w="70" w:type="dxa"/>
+              <w:start w:w="120" w:type="dxa"/>
+              <w:end w:w="120" w:type="dxa"/>
+            </w:tcMar>
+          </w:tcPr>
+          <w:p>
+            <w:pPr>
+              <w:spacing w:after="0" w:line="264" w:lineRule="auto"/>
+            </w:pPr>
+            <w:r>
+              <w:rPr>
+                <w:rFonts w:ascii="Calibri" w:hAnsi="Calibri"/>
+                <w:b w:val="0"/>
+                <w:i w:val="0"/>
+                <w:color w:val="1F1D1A"/>
+                <w:sz w:val="19"/>
+              </w:rPr>
+              <w:t>скриншот</w:t>
+            </w:r>
+          </w:p>
+        </w:tc>
+      </w:tr>
+      <w:tr>
+        <w:tc>
+          <w:tcPr>
+            <w:tcW w:type="dxa" w:w="567"/>
+            <w:tcBorders>
+              <w:top w:val="single" w:sz="4" w:color="E2DBCF"/>
+              <w:left w:val="single" w:sz="4" w:color="E2DBCF"/>
+              <w:bottom w:val="single" w:sz="4" w:color="E2DBCF"/>
+              <w:right w:val="single" w:sz="4" w:color="E2DBCF"/>
+            </w:tcBorders>
+            <w:tcMar>
+              <w:top w:w="70" w:type="dxa"/>
+              <w:bottom w:w="70" w:type="dxa"/>
+              <w:start w:w="120" w:type="dxa"/>
+              <w:end w:w="120" w:type="dxa"/>
+            </w:tcMar>
+          </w:tcPr>
+          <w:p>
+            <w:pPr>
+              <w:spacing w:after="0" w:line="264" w:lineRule="auto"/>
+            </w:pPr>
+            <w:r>
+              <w:rPr>
+                <w:rFonts w:ascii="Calibri" w:hAnsi="Calibri"/>
+                <w:b w:val="0"/>
+                <w:i w:val="0"/>
+                <w:color w:val="1F1D1A"/>
+                <w:sz w:val="19"/>
+              </w:rPr>
+              <w:t>29</w:t>
+            </w:r>
+          </w:p>
+        </w:tc>
+        <w:tc>
+          <w:tcPr>
+            <w:tcW w:type="dxa" w:w="907"/>
+            <w:tcBorders>
+              <w:top w:val="single" w:sz="4" w:color="E2DBCF"/>
+              <w:left w:val="single" w:sz="4" w:color="E2DBCF"/>
+              <w:bottom w:val="single" w:sz="4" w:color="E2DBCF"/>
+              <w:right w:val="single" w:sz="4" w:color="E2DBCF"/>
+            </w:tcBorders>
+            <w:tcMar>
+              <w:top w:w="70" w:type="dxa"/>
+              <w:bottom w:w="70" w:type="dxa"/>
+              <w:start w:w="120" w:type="dxa"/>
+              <w:end w:w="120" w:type="dxa"/>
+            </w:tcMar>
+          </w:tcPr>
+          <w:p>
+            <w:pPr>
+              <w:spacing w:after="0" w:line="264" w:lineRule="auto"/>
+            </w:pPr>
+            <w:r>
+              <w:rPr>
+                <w:rFonts w:ascii="Calibri" w:hAnsi="Calibri"/>
+                <w:b w:val="0"/>
+                <w:i w:val="0"/>
+                <w:color w:val="1F1D1A"/>
+                <w:sz w:val="19"/>
+              </w:rPr>
+              <w:t>10</w:t>
+            </w:r>
+          </w:p>
+        </w:tc>
+        <w:tc>
+          <w:tcPr>
+            <w:tcW w:type="dxa" w:w="680"/>
+            <w:tcBorders>
+              <w:top w:val="single" w:sz="4" w:color="E2DBCF"/>
+              <w:left w:val="single" w:sz="4" w:color="E2DBCF"/>
+              <w:bottom w:val="single" w:sz="4" w:color="E2DBCF"/>
+              <w:right w:val="single" w:sz="4" w:color="E2DBCF"/>
+            </w:tcBorders>
+            <w:tcMar>
+              <w:top w:w="70" w:type="dxa"/>
+              <w:bottom w:w="70" w:type="dxa"/>
+              <w:start w:w="120" w:type="dxa"/>
+              <w:end w:w="120" w:type="dxa"/>
+            </w:tcMar>
+          </w:tcPr>
+          <w:p>
+            <w:pPr>
+              <w:spacing w:after="0" w:line="264" w:lineRule="auto"/>
+            </w:pPr>
+            <w:r>
+              <w:rPr>
+                <w:rFonts w:ascii="Calibri" w:hAnsi="Calibri"/>
+                <w:b w:val="0"/>
+                <w:i w:val="0"/>
+                <w:color w:val="1F1D1A"/>
+                <w:sz w:val="19"/>
+              </w:rPr>
+              <w:t>Ср</w:t>
+            </w:r>
+          </w:p>
+        </w:tc>
+        <w:tc>
+          <w:tcPr>
+            <w:tcW w:type="dxa" w:w="5102"/>
+            <w:tcBorders>
+              <w:top w:val="single" w:sz="4" w:color="E2DBCF"/>
+              <w:left w:val="single" w:sz="4" w:color="E2DBCF"/>
+              <w:bottom w:val="single" w:sz="4" w:color="E2DBCF"/>
+              <w:right w:val="single" w:sz="4" w:color="E2DBCF"/>
+            </w:tcBorders>
+            <w:tcMar>
+              <w:top w:w="70" w:type="dxa"/>
+              <w:bottom w:w="70" w:type="dxa"/>
+              <w:start w:w="120" w:type="dxa"/>
+              <w:end w:w="120" w:type="dxa"/>
+            </w:tcMar>
+          </w:tcPr>
+          <w:p>
+            <w:pPr>
+              <w:spacing w:after="0" w:line="264" w:lineRule="auto"/>
+            </w:pPr>
+            <w:r>
+              <w:rPr>
+                <w:rFonts w:ascii="Calibri" w:hAnsi="Calibri"/>
+                <w:b w:val="0"/>
+                <w:i w:val="0"/>
+                <w:color w:val="1F1D1A"/>
+                <w:sz w:val="19"/>
+              </w:rPr>
+              <w:t>Что такое агент и субагент</w:t>
+            </w:r>
+          </w:p>
+        </w:tc>
+        <w:tc>
+          <w:tcPr>
+            <w:tcW w:type="dxa" w:w="2268"/>
+            <w:tcBorders>
+              <w:top w:val="single" w:sz="4" w:color="E2DBCF"/>
+              <w:left w:val="single" w:sz="4" w:color="E2DBCF"/>
+              <w:bottom w:val="single" w:sz="4" w:color="E2DBCF"/>
+              <w:right w:val="single" w:sz="4" w:color="E2DBCF"/>
+            </w:tcBorders>
+            <w:tcMar>
+              <w:top w:w="70" w:type="dxa"/>
+              <w:bottom w:w="70" w:type="dxa"/>
+              <w:start w:w="120" w:type="dxa"/>
+              <w:end w:w="120" w:type="dxa"/>
+            </w:tcMar>
+          </w:tcPr>
+          <w:p>
+            <w:pPr>
+              <w:spacing w:after="0" w:line="264" w:lineRule="auto"/>
+            </w:pPr>
+            <w:r>
+              <w:rPr>
+                <w:rFonts w:ascii="Calibri" w:hAnsi="Calibri"/>
+                <w:b w:val="0"/>
+                <w:i w:val="0"/>
+                <w:color w:val="1F1D1A"/>
+                <w:sz w:val="19"/>
+              </w:rPr>
+              <w:t>схема</w:t>
+            </w:r>
+          </w:p>
+        </w:tc>
+      </w:tr>
+      <w:tr>
+        <w:tc>
+          <w:tcPr>
+            <w:tcW w:type="dxa" w:w="567"/>
+            <w:shd w:val="clear" w:color="auto" w:fill="F7F4EF"/>
+            <w:tcBorders>
+              <w:top w:val="single" w:sz="4" w:color="E2DBCF"/>
+              <w:left w:val="single" w:sz="4" w:color="E2DBCF"/>
+              <w:bottom w:val="single" w:sz="4" w:color="E2DBCF"/>
+              <w:right w:val="single" w:sz="4" w:color="E2DBCF"/>
+            </w:tcBorders>
+            <w:tcMar>
+              <w:top w:w="70" w:type="dxa"/>
+              <w:bottom w:w="70" w:type="dxa"/>
+              <w:start w:w="120" w:type="dxa"/>
+              <w:end w:w="120" w:type="dxa"/>
+            </w:tcMar>
+          </w:tcPr>
+          <w:p>
+            <w:pPr>
+              <w:spacing w:after="0" w:line="264" w:lineRule="auto"/>
+            </w:pPr>
+            <w:r>
+              <w:rPr>
+                <w:rFonts w:ascii="Calibri" w:hAnsi="Calibri"/>
+                <w:b w:val="0"/>
+                <w:i w:val="0"/>
+                <w:color w:val="1F1D1A"/>
+                <w:sz w:val="19"/>
+              </w:rPr>
+              <w:t>30</w:t>
+            </w:r>
+          </w:p>
+        </w:tc>
+        <w:tc>
+          <w:tcPr>
+            <w:tcW w:type="dxa" w:w="907"/>
+            <w:shd w:val="clear" w:color="auto" w:fill="F7F4EF"/>
+            <w:tcBorders>
+              <w:top w:val="single" w:sz="4" w:color="E2DBCF"/>
+              <w:left w:val="single" w:sz="4" w:color="E2DBCF"/>
+              <w:bottom w:val="single" w:sz="4" w:color="E2DBCF"/>
+              <w:right w:val="single" w:sz="4" w:color="E2DBCF"/>
+            </w:tcBorders>
+            <w:tcMar>
+              <w:top w:w="70" w:type="dxa"/>
+              <w:bottom w:w="70" w:type="dxa"/>
+              <w:start w:w="120" w:type="dxa"/>
+              <w:end w:w="120" w:type="dxa"/>
+            </w:tcMar>
+          </w:tcPr>
+          <w:p>
+            <w:pPr>
+              <w:spacing w:after="0" w:line="264" w:lineRule="auto"/>
+            </w:pPr>
+            <w:r>
+              <w:rPr>
+                <w:rFonts w:ascii="Calibri" w:hAnsi="Calibri"/>
+                <w:b w:val="0"/>
+                <w:i w:val="0"/>
+                <w:color w:val="1F1D1A"/>
+                <w:sz w:val="19"/>
+              </w:rPr>
+              <w:t>10</w:t>
+            </w:r>
+          </w:p>
+        </w:tc>
+        <w:tc>
+          <w:tcPr>
+            <w:tcW w:type="dxa" w:w="680"/>
+            <w:shd w:val="clear" w:color="auto" w:fill="F7F4EF"/>
+            <w:tcBorders>
+              <w:top w:val="single" w:sz="4" w:color="E2DBCF"/>
+              <w:left w:val="single" w:sz="4" w:color="E2DBCF"/>
+              <w:bottom w:val="single" w:sz="4" w:color="E2DBCF"/>
+              <w:right w:val="single" w:sz="4" w:color="E2DBCF"/>
+            </w:tcBorders>
+            <w:tcMar>
+              <w:top w:w="70" w:type="dxa"/>
+              <w:bottom w:w="70" w:type="dxa"/>
+              <w:start w:w="120" w:type="dxa"/>
+              <w:end w:w="120" w:type="dxa"/>
+            </w:tcMar>
+          </w:tcPr>
+          <w:p>
+            <w:pPr>
+              <w:spacing w:after="0" w:line="264" w:lineRule="auto"/>
+            </w:pPr>
+            <w:r>
+              <w:rPr>
+                <w:rFonts w:ascii="Calibri" w:hAnsi="Calibri"/>
+                <w:b w:val="0"/>
+                <w:i w:val="0"/>
+                <w:color w:val="1F1D1A"/>
+                <w:sz w:val="19"/>
+              </w:rPr>
+              <w:t>Пт</w:t>
+            </w:r>
+          </w:p>
+        </w:tc>
+        <w:tc>
+          <w:tcPr>
+            <w:tcW w:type="dxa" w:w="5102"/>
+            <w:shd w:val="clear" w:color="auto" w:fill="F7F4EF"/>
+            <w:tcBorders>
+              <w:top w:val="single" w:sz="4" w:color="E2DBCF"/>
+              <w:left w:val="single" w:sz="4" w:color="E2DBCF"/>
+              <w:bottom w:val="single" w:sz="4" w:color="E2DBCF"/>
+              <w:right w:val="single" w:sz="4" w:color="E2DBCF"/>
+            </w:tcBorders>
+            <w:tcMar>
+              <w:top w:w="70" w:type="dxa"/>
+              <w:bottom w:w="70" w:type="dxa"/>
+              <w:start w:w="120" w:type="dxa"/>
+              <w:end w:w="120" w:type="dxa"/>
+            </w:tcMar>
+          </w:tcPr>
+          <w:p>
+            <w:pPr>
+              <w:spacing w:after="0" w:line="264" w:lineRule="auto"/>
+            </w:pPr>
+            <w:r>
+              <w:rPr>
+                <w:rFonts w:ascii="Calibri" w:hAnsi="Calibri"/>
+                <w:b w:val="0"/>
+                <w:i w:val="0"/>
+                <w:color w:val="1F1D1A"/>
+                <w:sz w:val="19"/>
+              </w:rPr>
+              <w:t>Команда агентов: тимлид и специалисты</w:t>
+            </w:r>
+          </w:p>
+        </w:tc>
+        <w:tc>
+          <w:tcPr>
+            <w:tcW w:type="dxa" w:w="2268"/>
+            <w:shd w:val="clear" w:color="auto" w:fill="F7F4EF"/>
+            <w:tcBorders>
+              <w:top w:val="single" w:sz="4" w:color="E2DBCF"/>
+              <w:left w:val="single" w:sz="4" w:color="E2DBCF"/>
+              <w:bottom w:val="single" w:sz="4" w:color="E2DBCF"/>
+              <w:right w:val="single" w:sz="4" w:color="E2DBCF"/>
+            </w:tcBorders>
+            <w:tcMar>
+              <w:top w:w="70" w:type="dxa"/>
+              <w:bottom w:w="70" w:type="dxa"/>
+              <w:start w:w="120" w:type="dxa"/>
+              <w:end w:w="120" w:type="dxa"/>
+            </w:tcMar>
+          </w:tcPr>
+          <w:p>
+            <w:pPr>
+              <w:spacing w:after="0" w:line="264" w:lineRule="auto"/>
+            </w:pPr>
+            <w:r>
+              <w:rPr>
+                <w:rFonts w:ascii="Calibri" w:hAnsi="Calibri"/>
+                <w:b w:val="0"/>
+                <w:i w:val="0"/>
+                <w:color w:val="1F1D1A"/>
+                <w:sz w:val="19"/>
+              </w:rPr>
+              <w:t>схема</w:t>
+            </w:r>
+          </w:p>
+        </w:tc>
+      </w:tr>
+      <w:tr>
+        <w:tc>
+          <w:tcPr>
+            <w:tcW w:type="dxa" w:w="567"/>
+            <w:tcBorders>
+              <w:top w:val="single" w:sz="4" w:color="E2DBCF"/>
+              <w:left w:val="single" w:sz="4" w:color="E2DBCF"/>
+              <w:bottom w:val="single" w:sz="4" w:color="E2DBCF"/>
+              <w:right w:val="single" w:sz="4" w:color="E2DBCF"/>
+            </w:tcBorders>
+            <w:tcMar>
+              <w:top w:w="70" w:type="dxa"/>
+              <w:bottom w:w="70" w:type="dxa"/>
+              <w:start w:w="120" w:type="dxa"/>
+              <w:end w:w="120" w:type="dxa"/>
+            </w:tcMar>
+          </w:tcPr>
+          <w:p>
+            <w:pPr>
+              <w:spacing w:after="0" w:line="264" w:lineRule="auto"/>
+            </w:pPr>
+            <w:r>
+              <w:rPr>
+                <w:rFonts w:ascii="Calibri" w:hAnsi="Calibri"/>
+                <w:b w:val="0"/>
+                <w:i w:val="0"/>
+                <w:color w:val="1F1D1A"/>
+                <w:sz w:val="19"/>
+              </w:rPr>
+              <w:t>31</w:t>
+            </w:r>
+          </w:p>
+        </w:tc>
+        <w:tc>
+          <w:tcPr>
+            <w:tcW w:type="dxa" w:w="907"/>
+            <w:tcBorders>
+              <w:top w:val="single" w:sz="4" w:color="E2DBCF"/>
+              <w:left w:val="single" w:sz="4" w:color="E2DBCF"/>
+              <w:bottom w:val="single" w:sz="4" w:color="E2DBCF"/>
+              <w:right w:val="single" w:sz="4" w:color="E2DBCF"/>
+            </w:tcBorders>
+            <w:tcMar>
+              <w:top w:w="70" w:type="dxa"/>
+              <w:bottom w:w="70" w:type="dxa"/>
+              <w:start w:w="120" w:type="dxa"/>
+              <w:end w:w="120" w:type="dxa"/>
+            </w:tcMar>
+          </w:tcPr>
+          <w:p>
+            <w:pPr>
+              <w:spacing w:after="0" w:line="264" w:lineRule="auto"/>
+            </w:pPr>
+            <w:r>
+              <w:rPr>
+                <w:rFonts w:ascii="Calibri" w:hAnsi="Calibri"/>
+                <w:b w:val="0"/>
+                <w:i w:val="0"/>
+                <w:color w:val="1F1D1A"/>
+                <w:sz w:val="19"/>
+              </w:rPr>
+              <w:t>11</w:t>
+            </w:r>
+          </w:p>
+        </w:tc>
+        <w:tc>
+          <w:tcPr>
+            <w:tcW w:type="dxa" w:w="680"/>
+            <w:tcBorders>
+              <w:top w:val="single" w:sz="4" w:color="E2DBCF"/>
+              <w:left w:val="single" w:sz="4" w:color="E2DBCF"/>
+              <w:bottom w:val="single" w:sz="4" w:color="E2DBCF"/>
+              <w:right w:val="single" w:sz="4" w:color="E2DBCF"/>
+            </w:tcBorders>
+            <w:tcMar>
+              <w:top w:w="70" w:type="dxa"/>
+              <w:bottom w:w="70" w:type="dxa"/>
+              <w:start w:w="120" w:type="dxa"/>
+              <w:end w:w="120" w:type="dxa"/>
+            </w:tcMar>
+          </w:tcPr>
+          <w:p>
+            <w:pPr>
+              <w:spacing w:after="0" w:line="264" w:lineRule="auto"/>
+            </w:pPr>
+            <w:r>
+              <w:rPr>
+                <w:rFonts w:ascii="Calibri" w:hAnsi="Calibri"/>
+                <w:b w:val="0"/>
+                <w:i w:val="0"/>
+                <w:color w:val="1F1D1A"/>
+                <w:sz w:val="19"/>
+              </w:rPr>
+              <w:t>Пн</w:t>
+            </w:r>
+          </w:p>
+        </w:tc>
+        <w:tc>
+          <w:tcPr>
+            <w:tcW w:type="dxa" w:w="5102"/>
+            <w:tcBorders>
+              <w:top w:val="single" w:sz="4" w:color="E2DBCF"/>
+              <w:left w:val="single" w:sz="4" w:color="E2DBCF"/>
+              <w:bottom w:val="single" w:sz="4" w:color="E2DBCF"/>
+              <w:right w:val="single" w:sz="4" w:color="E2DBCF"/>
+            </w:tcBorders>
+            <w:tcMar>
+              <w:top w:w="70" w:type="dxa"/>
+              <w:bottom w:w="70" w:type="dxa"/>
+              <w:start w:w="120" w:type="dxa"/>
+              <w:end w:w="120" w:type="dxa"/>
+            </w:tcMar>
+          </w:tcPr>
+          <w:p>
+            <w:pPr>
+              <w:spacing w:after="0" w:line="264" w:lineRule="auto"/>
+            </w:pPr>
+            <w:r>
+              <w:rPr>
+                <w:rFonts w:ascii="Calibri" w:hAnsi="Calibri"/>
+                <w:b w:val="0"/>
+                <w:i w:val="0"/>
+                <w:color w:val="1F1D1A"/>
+                <w:sz w:val="19"/>
+              </w:rPr>
+              <w:t>Контроль качества на «заводе»</w:t>
+            </w:r>
+          </w:p>
+        </w:tc>
+        <w:tc>
+          <w:tcPr>
+            <w:tcW w:type="dxa" w:w="2268"/>
+            <w:tcBorders>
+              <w:top w:val="single" w:sz="4" w:color="E2DBCF"/>
+              <w:left w:val="single" w:sz="4" w:color="E2DBCF"/>
+              <w:bottom w:val="single" w:sz="4" w:color="E2DBCF"/>
+              <w:right w:val="single" w:sz="4" w:color="E2DBCF"/>
+            </w:tcBorders>
+            <w:tcMar>
+              <w:top w:w="70" w:type="dxa"/>
+              <w:bottom w:w="70" w:type="dxa"/>
+              <w:start w:w="120" w:type="dxa"/>
+              <w:end w:w="120" w:type="dxa"/>
+            </w:tcMar>
+          </w:tcPr>
+          <w:p>
+            <w:pPr>
+              <w:spacing w:after="0" w:line="264" w:lineRule="auto"/>
+            </w:pPr>
+            <w:r>
+              <w:rPr>
+                <w:rFonts w:ascii="Calibri" w:hAnsi="Calibri"/>
+                <w:b w:val="0"/>
+                <w:i w:val="0"/>
+                <w:color w:val="1F1D1A"/>
+                <w:sz w:val="19"/>
+              </w:rPr>
+              <w:t>схема</w:t>
+            </w:r>
+          </w:p>
+        </w:tc>
+      </w:tr>
+      <w:tr>
+        <w:tc>
+          <w:tcPr>
+            <w:tcW w:type="dxa" w:w="567"/>
+            <w:shd w:val="clear" w:color="auto" w:fill="F7F4EF"/>
+            <w:tcBorders>
+              <w:top w:val="single" w:sz="4" w:color="E2DBCF"/>
+              <w:left w:val="single" w:sz="4" w:color="E2DBCF"/>
+              <w:bottom w:val="single" w:sz="4" w:color="E2DBCF"/>
+              <w:right w:val="single" w:sz="4" w:color="E2DBCF"/>
+            </w:tcBorders>
+            <w:tcMar>
+              <w:top w:w="70" w:type="dxa"/>
+              <w:bottom w:w="70" w:type="dxa"/>
+              <w:start w:w="120" w:type="dxa"/>
+              <w:end w:w="120" w:type="dxa"/>
+            </w:tcMar>
+          </w:tcPr>
+          <w:p>
+            <w:pPr>
+              <w:spacing w:after="0" w:line="264" w:lineRule="auto"/>
+            </w:pPr>
+            <w:r>
+              <w:rPr>
+                <w:rFonts w:ascii="Calibri" w:hAnsi="Calibri"/>
+                <w:b w:val="0"/>
+                <w:i w:val="0"/>
+                <w:color w:val="1F1D1A"/>
+                <w:sz w:val="19"/>
+              </w:rPr>
+              <w:t>32</w:t>
+            </w:r>
+          </w:p>
+        </w:tc>
+        <w:tc>
+          <w:tcPr>
+            <w:tcW w:type="dxa" w:w="907"/>
+            <w:shd w:val="clear" w:color="auto" w:fill="F7F4EF"/>
+            <w:tcBorders>
+              <w:top w:val="single" w:sz="4" w:color="E2DBCF"/>
+              <w:left w:val="single" w:sz="4" w:color="E2DBCF"/>
+              <w:bottom w:val="single" w:sz="4" w:color="E2DBCF"/>
+              <w:right w:val="single" w:sz="4" w:color="E2DBCF"/>
+            </w:tcBorders>
+            <w:tcMar>
+              <w:top w:w="70" w:type="dxa"/>
+              <w:bottom w:w="70" w:type="dxa"/>
+              <w:start w:w="120" w:type="dxa"/>
+              <w:end w:w="120" w:type="dxa"/>
+            </w:tcMar>
+          </w:tcPr>
+          <w:p>
+            <w:pPr>
+              <w:spacing w:after="0" w:line="264" w:lineRule="auto"/>
+            </w:pPr>
+            <w:r>
+              <w:rPr>
+                <w:rFonts w:ascii="Calibri" w:hAnsi="Calibri"/>
+                <w:b w:val="0"/>
+                <w:i w:val="0"/>
+                <w:color w:val="1F1D1A"/>
+                <w:sz w:val="19"/>
+              </w:rPr>
+              <w:t>11</w:t>
+            </w:r>
+          </w:p>
+        </w:tc>
+        <w:tc>
+          <w:tcPr>
+            <w:tcW w:type="dxa" w:w="680"/>
+            <w:shd w:val="clear" w:color="auto" w:fill="F7F4EF"/>
+            <w:tcBorders>
+              <w:top w:val="single" w:sz="4" w:color="E2DBCF"/>
+              <w:left w:val="single" w:sz="4" w:color="E2DBCF"/>
+              <w:bottom w:val="single" w:sz="4" w:color="E2DBCF"/>
+              <w:right w:val="single" w:sz="4" w:color="E2DBCF"/>
+            </w:tcBorders>
+            <w:tcMar>
+              <w:top w:w="70" w:type="dxa"/>
+              <w:bottom w:w="70" w:type="dxa"/>
+              <w:start w:w="120" w:type="dxa"/>
+              <w:end w:w="120" w:type="dxa"/>
+            </w:tcMar>
+          </w:tcPr>
+          <w:p>
+            <w:pPr>
+              <w:spacing w:after="0" w:line="264" w:lineRule="auto"/>
+            </w:pPr>
+            <w:r>
+              <w:rPr>
+                <w:rFonts w:ascii="Calibri" w:hAnsi="Calibri"/>
+                <w:b w:val="0"/>
+                <w:i w:val="0"/>
+                <w:color w:val="1F1D1A"/>
+                <w:sz w:val="19"/>
+              </w:rPr>
+              <w:t>Ср</w:t>
+            </w:r>
+          </w:p>
+        </w:tc>
+        <w:tc>
+          <w:tcPr>
+            <w:tcW w:type="dxa" w:w="5102"/>
             <w:shd w:val="clear" w:color="auto" w:fill="F7F4EF"/>
             <w:tcBorders>
               <w:top w:val="single" w:sz="4" w:color="E2DBCF"/>
@@ -5446,7 +6520,7 @@
           <w:color w:val="6B665E"/>
           <w:sz w:val="19"/>
         </w:rPr>
-        <w:t>Модуль 1 · неделя 1 · медиа: схема</w:t>
+        <w:t>Модуль 1 · неделя 1, понедельник · медиа: схема</w:t>
       </w:r>
     </w:p>
     <w:p>
@@ -5532,7 +6606,7 @@
                 <w:color w:val="1F1D1A"/>
                 <w:sz w:val="22"/>
               </w:rPr>
-              <w:t>Урок 1. Что такое Claude и чем он не является</w:t>
+              <w:t>Что такое Claude и чем он не является</w:t>
             </w:r>
           </w:p>
           <w:p>
@@ -5552,7 +6626,7 @@
                 <w:color w:val="1F1D1A"/>
                 <w:sz w:val="22"/>
               </w:rPr>
-              <w:t>Коллеги, начинаем серию коротких уроков по работе с ИИ. Два раза в неделю — одна тема, без лишней теории.</w:t>
+              <w:t>Коллеги, начинаем серию коротких уроков по работе с ИИ. Три раза в неделю — одна тема, без лишней теории.</w:t>
             </w:r>
           </w:p>
           <w:p>
@@ -5774,22 +6848,6 @@
     </w:p>
     <w:p>
       <w:pPr>
-        <w:spacing w:after="120" w:before="0" w:line="276" w:lineRule="auto"/>
-        <w:jc w:val="center"/>
-      </w:pPr>
-      <w:r>
-        <w:rPr>
-          <w:rFonts w:ascii="Calibri" w:hAnsi="Calibri"/>
-          <w:b w:val="0"/>
-          <w:i/>
-          <w:color w:val="6B665E"/>
-          <w:sz w:val="18"/>
-        </w:rPr>
-        <w:t>Схема к посту 1 (файл d01_how_it_works.png)</w:t>
-      </w:r>
-    </w:p>
-    <w:p>
-      <w:pPr>
         <w:keepNext/>
         <w:spacing w:after="60" w:before="200" w:line="276" w:lineRule="auto"/>
       </w:pPr>
@@ -5844,7 +6902,7 @@
           <w:color w:val="6B665E"/>
           <w:sz w:val="19"/>
         </w:rPr>
-        <w:t>Модуль 1 · неделя 1 · медиа: схема</w:t>
+        <w:t>Модуль 1 · неделя 1, среда · медиа: схема</w:t>
       </w:r>
     </w:p>
     <w:p>
@@ -5930,7 +6988,7 @@
                 <w:color w:val="1F1D1A"/>
                 <w:sz w:val="22"/>
               </w:rPr>
-              <w:t>Урок 2. Токены — «единица измерения» ИИ</w:t>
+              <w:t>Токены — «единица измерения» ИИ</w:t>
             </w:r>
           </w:p>
           <w:p>
@@ -6167,22 +7225,6 @@
     </w:p>
     <w:p>
       <w:pPr>
-        <w:spacing w:after="120" w:before="0" w:line="276" w:lineRule="auto"/>
-        <w:jc w:val="center"/>
-      </w:pPr>
-      <w:r>
-        <w:rPr>
-          <w:rFonts w:ascii="Calibri" w:hAnsi="Calibri"/>
-          <w:b w:val="0"/>
-          <w:i/>
-          <w:color w:val="6B665E"/>
-          <w:sz w:val="18"/>
-        </w:rPr>
-        <w:t>Схема к посту 2 (файл d02_tokens.png)</w:t>
-      </w:r>
-    </w:p>
-    <w:p>
-      <w:pPr>
         <w:keepNext/>
         <w:spacing w:after="60" w:before="200" w:line="276" w:lineRule="auto"/>
       </w:pPr>
@@ -6237,7 +7279,7 @@
           <w:color w:val="6B665E"/>
           <w:sz w:val="19"/>
         </w:rPr>
-        <w:t>Модуль 1 · неделя 2 · медиа: схема</w:t>
+        <w:t>Модуль 1 · неделя 1, пятница · медиа: схема</w:t>
       </w:r>
     </w:p>
     <w:p>
@@ -6323,7 +7365,7 @@
                 <w:color w:val="1F1D1A"/>
                 <w:sz w:val="22"/>
               </w:rPr>
-              <w:t>Урок 3. Контекстное окно: что Claude «помнит»</w:t>
+              <w:t>Контекстное окно: что Claude «помнит»</w:t>
             </w:r>
           </w:p>
           <w:p>
@@ -6418,7 +7460,7 @@
                 <w:color w:val="1F1D1A"/>
                 <w:sz w:val="22"/>
               </w:rPr>
-              <w:t>Кроме того, по умолчанию Claude не помнит содержание других чатов. Каждый новый чат начинается с чистого листа. Исключения — проекты (о них в уроке 16) и функция памяти, если она включена в настройках.</w:t>
+              <w:t>Кроме того, по умолчанию Claude не помнит содержание других чатов. Каждый новый чат начинается с чистого листа. Исключения — проекты (о них расскажу в одном из следующих постов) и функция памяти, если она включена в настройках.</w:t>
             </w:r>
           </w:p>
           <w:p>
@@ -6574,22 +7616,6 @@
       </w:r>
     </w:p>
     <w:p>
-      <w:pPr>
-        <w:spacing w:after="120" w:before="0" w:line="276" w:lineRule="auto"/>
-        <w:jc w:val="center"/>
-      </w:pPr>
-      <w:r>
-        <w:rPr>
-          <w:rFonts w:ascii="Calibri" w:hAnsi="Calibri"/>
-          <w:b w:val="0"/>
-          <w:i/>
-          <w:color w:val="6B665E"/>
-          <w:sz w:val="18"/>
-        </w:rPr>
-        <w:t>Схема к посту 3 (файл d03_context.png)</w:t>
-      </w:r>
-    </w:p>
-    <w:p>
       <w:r>
         <w:br w:type="page"/>
       </w:r>
@@ -6614,7 +7640,7 @@
           <w:color w:val="6B665E"/>
           <w:sz w:val="19"/>
         </w:rPr>
-        <w:t>Модуль 1 · неделя 2 · медиа: скриншот</w:t>
+        <w:t>Модуль 1 · неделя 2, понедельник · медиа: скриншот</w:t>
       </w:r>
     </w:p>
     <w:p>
@@ -6700,7 +7726,7 @@
                 <w:color w:val="1F1D1A"/>
                 <w:sz w:val="22"/>
               </w:rPr>
-              <w:t>Урок 4. Лимиты: почему «закончились сообщения» и как экономить</w:t>
+              <w:t>Лимиты: почему «закончились сообщения» и как экономить</w:t>
             </w:r>
           </w:p>
           <w:p>
@@ -7110,7 +8136,7 @@
           <w:color w:val="6B665E"/>
           <w:sz w:val="19"/>
         </w:rPr>
-        <w:t>Модуль 1 · неделя 3 · медиа: скриншот</w:t>
+        <w:t>Модуль 1 · неделя 2, среда · медиа: скриншот</w:t>
       </w:r>
     </w:p>
     <w:p>
@@ -7196,7 +8222,7 @@
                 <w:color w:val="1F1D1A"/>
                 <w:sz w:val="22"/>
               </w:rPr>
-              <w:t>Урок 5. Модели Claude: какую выбрать</w:t>
+              <w:t>Модели Claude: какую выбрать</w:t>
             </w:r>
           </w:p>
           <w:p>
@@ -7485,7 +8511,7 @@
           <w:color w:val="6B665E"/>
           <w:sz w:val="19"/>
         </w:rPr>
-        <w:t>Модуль 1 · неделя 3 · медиа: скриншот</w:t>
+        <w:t>Модуль 1 · неделя 2, пятница · медиа: скриншот</w:t>
       </w:r>
     </w:p>
     <w:p>
@@ -7571,7 +8597,7 @@
                 <w:color w:val="1F1D1A"/>
                 <w:sz w:val="22"/>
               </w:rPr>
-              <w:t>Урок 6. Галлюцинации: почему ИИ уверенно ошибается</w:t>
+              <w:t>Галлюцинации: почему ИИ уверенно ошибается</w:t>
             </w:r>
           </w:p>
           <w:p>
@@ -7890,7 +8916,7 @@
           <w:color w:val="6B665E"/>
           <w:sz w:val="19"/>
         </w:rPr>
-        <w:t>Модуль 1 · неделя 4 · медиа: карточка</w:t>
+        <w:t>Модуль 1 · неделя 3, понедельник · медиа: карточка</w:t>
       </w:r>
     </w:p>
     <w:p>
@@ -7976,7 +9002,7 @@
                 <w:color w:val="1F1D1A"/>
                 <w:sz w:val="22"/>
               </w:rPr>
-              <w:t>Урок 7. Конфиденциальность: что можно и что нельзя загружать</w:t>
+              <w:t>Конфиденциальность: что можно и что нельзя загружать</w:t>
             </w:r>
           </w:p>
           <w:p>
@@ -8273,22 +9299,6 @@
     </w:p>
     <w:p>
       <w:pPr>
-        <w:spacing w:after="120" w:before="0" w:line="276" w:lineRule="auto"/>
-        <w:jc w:val="center"/>
-      </w:pPr>
-      <w:r>
-        <w:rPr>
-          <w:rFonts w:ascii="Calibri" w:hAnsi="Calibri"/>
-          <w:b w:val="0"/>
-          <w:i/>
-          <w:color w:val="6B665E"/>
-          <w:sz w:val="18"/>
-        </w:rPr>
-        <w:t>Схема к посту 7 (файл d07_privacy.png)</w:t>
-      </w:r>
-    </w:p>
-    <w:p>
-      <w:pPr>
         <w:keepNext/>
         <w:spacing w:after="60" w:before="200" w:line="276" w:lineRule="auto"/>
       </w:pPr>
@@ -8366,7 +9376,7 @@
           <w:color w:val="6B665E"/>
           <w:sz w:val="19"/>
         </w:rPr>
-        <w:t>Модуль 2 · неделя 4 · медиа: схема, документ</w:t>
+        <w:t>Модуль 2 · неделя 3, среда · медиа: схема, документ</w:t>
       </w:r>
     </w:p>
     <w:p>
@@ -8452,7 +9462,7 @@
                 <w:color w:val="1F1D1A"/>
                 <w:sz w:val="22"/>
               </w:rPr>
-              <w:t>Урок 8. Анатомия хорошего промта</w:t>
+              <w:t>Анатомия хорошего промта</w:t>
             </w:r>
           </w:p>
           <w:p>
@@ -8785,22 +9795,6 @@
       </w:r>
     </w:p>
     <w:p>
-      <w:pPr>
-        <w:spacing w:after="120" w:before="0" w:line="276" w:lineRule="auto"/>
-        <w:jc w:val="center"/>
-      </w:pPr>
-      <w:r>
-        <w:rPr>
-          <w:rFonts w:ascii="Calibri" w:hAnsi="Calibri"/>
-          <w:b w:val="0"/>
-          <w:i/>
-          <w:color w:val="6B665E"/>
-          <w:sz w:val="18"/>
-        </w:rPr>
-        <w:t>Схема к посту 8 (файл d08_prompt_anatomy.png)</w:t>
-      </w:r>
-    </w:p>
-    <w:p>
       <w:r>
         <w:br w:type="page"/>
       </w:r>
@@ -8825,7 +9819,7 @@
           <w:color w:val="6B665E"/>
           <w:sz w:val="19"/>
         </w:rPr>
-        <w:t>Модуль 2 · неделя 5 · медиа: скриншот</w:t>
+        <w:t>Модуль 2 · неделя 3, пятница · медиа: скриншот</w:t>
       </w:r>
     </w:p>
     <w:p>
@@ -8911,7 +9905,7 @@
                 <w:color w:val="1F1D1A"/>
                 <w:sz w:val="22"/>
               </w:rPr>
-              <w:t>Урок 9. Роль и контекст</w:t>
+              <w:t>Роль и контекст</w:t>
             </w:r>
           </w:p>
           <w:p>
@@ -9169,7 +10163,7 @@
           <w:color w:val="6B665E"/>
           <w:sz w:val="19"/>
         </w:rPr>
-        <w:t>Модуль 2 · неделя 5 · медиа: скриншот</w:t>
+        <w:t>Модуль 2 · неделя 4, понедельник · медиа: скриншот</w:t>
       </w:r>
     </w:p>
     <w:p>
@@ -9255,7 +10249,7 @@
                 <w:color w:val="1F1D1A"/>
                 <w:sz w:val="22"/>
               </w:rPr>
-              <w:t>Урок 10. Формат ответа: заказывайте результат сразу</w:t>
+              <w:t>Формат ответа: заказывайте результат сразу</w:t>
             </w:r>
           </w:p>
           <w:p>
@@ -9533,7 +10527,7 @@
           <w:color w:val="6B665E"/>
           <w:sz w:val="19"/>
         </w:rPr>
-        <w:t>Модуль 2 · неделя 6 · медиа: скриншот</w:t>
+        <w:t>Модуль 2 · неделя 4, среда · медиа: скриншот</w:t>
       </w:r>
     </w:p>
     <w:p>
@@ -9619,7 +10613,7 @@
                 <w:color w:val="1F1D1A"/>
                 <w:sz w:val="22"/>
               </w:rPr>
-              <w:t>Урок 11. Примеры: покажите, что хотите получить</w:t>
+              <w:t>Примеры: покажите, что хотите получить</w:t>
             </w:r>
           </w:p>
           <w:p>
@@ -9932,7 +10926,7 @@
           <w:color w:val="6B665E"/>
           <w:sz w:val="19"/>
         </w:rPr>
-        <w:t>Модуль 2 · неделя 6 · медиа: видео</w:t>
+        <w:t>Модуль 2 · неделя 4, пятница · медиа: видео</w:t>
       </w:r>
     </w:p>
     <w:p>
@@ -10018,7 +11012,7 @@
                 <w:color w:val="1F1D1A"/>
                 <w:sz w:val="22"/>
               </w:rPr>
-              <w:t>Урок 12. Самопроверка и взгляд критика</w:t>
+              <w:t>Самопроверка и взгляд критика</w:t>
             </w:r>
           </w:p>
           <w:p>
@@ -11226,7 +12220,7 @@
           <w:color w:val="6B665E"/>
           <w:sz w:val="19"/>
         </w:rPr>
-        <w:t>Модуль 2 · неделя 7 · медиа: видео</w:t>
+        <w:t>Модуль 2 · неделя 5, понедельник · медиа: видео</w:t>
       </w:r>
     </w:p>
     <w:p>
@@ -11312,7 +12306,7 @@
                 <w:color w:val="1F1D1A"/>
                 <w:sz w:val="22"/>
               </w:rPr>
-              <w:t>Урок 13. Итерации: первый ответ — это черновик</w:t>
+              <w:t>Итерации: первый ответ — это черновик</w:t>
             </w:r>
           </w:p>
           <w:p>
@@ -12540,7 +13534,7 @@
           <w:color w:val="6B665E"/>
           <w:sz w:val="19"/>
         </w:rPr>
-        <w:t>Модуль 2 · неделя 7 · медиа: опрос, скриншот</w:t>
+        <w:t>Модуль 2 · неделя 5, среда · медиа: опрос, скриншот</w:t>
       </w:r>
     </w:p>
     <w:p>
@@ -12626,7 +13620,7 @@
                 <w:color w:val="1F1D1A"/>
                 <w:sz w:val="22"/>
               </w:rPr>
-              <w:t>Урок 14. Разбор ваших промтов</w:t>
+              <w:t>Разбор ваших промтов</w:t>
             </w:r>
           </w:p>
           <w:p>
@@ -12904,7 +13898,7 @@
           <w:color w:val="6B665E"/>
           <w:sz w:val="19"/>
         </w:rPr>
-        <w:t>Модуль 3 · неделя 8 · медиа: видео</w:t>
+        <w:t>Модуль 3 · неделя 5, пятница · медиа: видео</w:t>
       </w:r>
     </w:p>
     <w:p>
@@ -12990,7 +13984,7 @@
                 <w:color w:val="1F1D1A"/>
                 <w:sz w:val="22"/>
               </w:rPr>
-              <w:t>Урок 15. Работа с файлами</w:t>
+              <w:t>Работа с файлами</w:t>
             </w:r>
           </w:p>
           <w:p>
@@ -13230,7 +14224,7 @@
                 <w:color w:val="1F1D1A"/>
                 <w:sz w:val="22"/>
               </w:rPr>
-              <w:t>3. Не забывайте про урок 7: перед загрузкой уберите конфиденциальные данные.</w:t>
+              <w:t>3. Помните о конфиденциальности: перед загрузкой уберите чувствительные данные.</w:t>
             </w:r>
           </w:p>
           <w:p>
@@ -14180,7 +15174,7 @@
           <w:color w:val="6B665E"/>
           <w:sz w:val="19"/>
         </w:rPr>
-        <w:t>Модуль 3 · неделя 8 · медиа: видео</w:t>
+        <w:t>Модуль 3 · неделя 6, понедельник · медиа: видео</w:t>
       </w:r>
     </w:p>
     <w:p>
@@ -14266,7 +15260,7 @@
                 <w:color w:val="1F1D1A"/>
                 <w:sz w:val="22"/>
               </w:rPr>
-              <w:t>Урок 16. Проекты: один раз объяснить, всегда пользоваться</w:t>
+              <w:t>Проекты: один раз объяснить, всегда пользоваться</w:t>
             </w:r>
           </w:p>
           <w:p>
@@ -15570,7 +16564,7 @@
           <w:color w:val="6B665E"/>
           <w:sz w:val="19"/>
         </w:rPr>
-        <w:t>Модуль 3 · неделя 9 · медиа: скриншот</w:t>
+        <w:t>Модуль 3 · неделя 6, среда · медиа: скриншот</w:t>
       </w:r>
     </w:p>
     <w:p>
@@ -15656,7 +16650,7 @@
                 <w:color w:val="1F1D1A"/>
                 <w:sz w:val="22"/>
               </w:rPr>
-              <w:t>Урок 17. Расширенное мышление и веб-поиск</w:t>
+              <w:t>Расширенное мышление и веб-поиск</w:t>
             </w:r>
           </w:p>
           <w:p>
@@ -16081,7 +17075,7 @@
           <w:color w:val="6B665E"/>
           <w:sz w:val="19"/>
         </w:rPr>
-        <w:t>Модуль 3 · неделя 9 · медиа: видео</w:t>
+        <w:t>Модуль 3 · неделя 6, пятница · медиа: видео</w:t>
       </w:r>
     </w:p>
     <w:p>
@@ -16167,7 +17161,7 @@
                 <w:color w:val="1F1D1A"/>
                 <w:sz w:val="22"/>
               </w:rPr>
-              <w:t>Урок 18. Артефакты: документы, таблицы и схемы прямо в чате</w:t>
+              <w:t>Артефакты: документы, таблицы и схемы прямо в чате</w:t>
             </w:r>
           </w:p>
           <w:p>
@@ -17566,7 +18560,7 @@
           <w:color w:val="6B665E"/>
           <w:sz w:val="19"/>
         </w:rPr>
-        <w:t>Модуль 3 · неделя 10 · медиа: схема</w:t>
+        <w:t>Модуль 3 · неделя 7, понедельник · медиа: схема</w:t>
       </w:r>
     </w:p>
     <w:p>
@@ -17652,7 +18646,7 @@
                 <w:color w:val="1F1D1A"/>
                 <w:sz w:val="22"/>
               </w:rPr>
-              <w:t>Урок 19. Chat или Code: где работать</w:t>
+              <w:t>Chat или Code: где работать</w:t>
             </w:r>
           </w:p>
           <w:p>
@@ -17954,22 +18948,6 @@
     </w:p>
     <w:p>
       <w:pPr>
-        <w:spacing w:after="120" w:before="0" w:line="276" w:lineRule="auto"/>
-        <w:jc w:val="center"/>
-      </w:pPr>
-      <w:r>
-        <w:rPr>
-          <w:rFonts w:ascii="Calibri" w:hAnsi="Calibri"/>
-          <w:b w:val="0"/>
-          <w:i/>
-          <w:color w:val="6B665E"/>
-          <w:sz w:val="18"/>
-        </w:rPr>
-        <w:t>Схема к посту 19 (файл d19_chat_vs_code.png)</w:t>
-      </w:r>
-    </w:p>
-    <w:p>
-      <w:pPr>
         <w:keepNext/>
         <w:spacing w:after="60" w:before="200" w:line="276" w:lineRule="auto"/>
       </w:pPr>
@@ -18047,7 +19025,7 @@
           <w:color w:val="6B665E"/>
           <w:sz w:val="19"/>
         </w:rPr>
-        <w:t>Модуль 4 · неделя 10 · медиа: видео, скриншот</w:t>
+        <w:t>Модуль 4 · неделя 7, среда · медиа: видео, скриншот</w:t>
       </w:r>
     </w:p>
     <w:p>
@@ -18133,7 +19111,7 @@
                 <w:color w:val="1F1D1A"/>
                 <w:sz w:val="22"/>
               </w:rPr>
-              <w:t>Урок 20. Первый запуск Code</w:t>
+              <w:t>Первый запуск Code</w:t>
             </w:r>
           </w:p>
           <w:p>
@@ -19822,7 +20800,7 @@
           <w:color w:val="6B665E"/>
           <w:sz w:val="19"/>
         </w:rPr>
-        <w:t>Модуль 4 · неделя 11 · медиа: видео</w:t>
+        <w:t>Модуль 4 · неделя 7, пятница · медиа: видео</w:t>
       </w:r>
     </w:p>
     <w:p>
@@ -19908,7 +20886,7 @@
                 <w:color w:val="1F1D1A"/>
                 <w:sz w:val="22"/>
               </w:rPr>
-              <w:t>Урок 21. Правка документов прямо в папке</w:t>
+              <w:t>Правка документов прямо в папке</w:t>
             </w:r>
           </w:p>
           <w:p>
@@ -21192,7 +22170,7 @@
           <w:color w:val="6B665E"/>
           <w:sz w:val="19"/>
         </w:rPr>
-        <w:t>Модуль 4 · неделя 11 · медиа: видео</w:t>
+        <w:t>Модуль 4 · неделя 8, понедельник · медиа: видео</w:t>
       </w:r>
     </w:p>
     <w:p>
@@ -21278,7 +22256,7 @@
                 <w:color w:val="1F1D1A"/>
                 <w:sz w:val="22"/>
               </w:rPr>
-              <w:t>Урок 22. Расчёты кодом</w:t>
+              <w:t>Расчёты кодом</w:t>
             </w:r>
           </w:p>
           <w:p>
@@ -22582,7 +23560,7 @@
           <w:color w:val="6B665E"/>
           <w:sz w:val="19"/>
         </w:rPr>
-        <w:t>Модуль 4 · неделя 12 · медиа: видео, скриншот</w:t>
+        <w:t>Модуль 4 · неделя 8, среда · медиа: видео, скриншот</w:t>
       </w:r>
     </w:p>
     <w:p>
@@ -22668,7 +23646,7 @@
                 <w:color w:val="1F1D1A"/>
                 <w:sz w:val="22"/>
               </w:rPr>
-              <w:t>Урок 23. Чертежи и 3D-модели</w:t>
+              <w:t>Чертежи и 3D-модели</w:t>
             </w:r>
           </w:p>
           <w:p>
@@ -24098,7 +25076,7 @@
           <w:color w:val="6B665E"/>
           <w:sz w:val="19"/>
         </w:rPr>
-        <w:t>Модуль 4 · неделя 12 · медиа: видео</w:t>
+        <w:t>Модуль 4 · неделя 8, пятница · медиа: видео</w:t>
       </w:r>
     </w:p>
     <w:p>
@@ -24184,7 +25162,7 @@
                 <w:color w:val="1F1D1A"/>
                 <w:sz w:val="22"/>
               </w:rPr>
-              <w:t>Урок 24. Пакетная обработка и перевод документации</w:t>
+              <w:t>Пакетная обработка и перевод документации</w:t>
             </w:r>
           </w:p>
           <w:p>
@@ -25453,7 +26431,7 @@
           <w:color w:val="6B665E"/>
           <w:sz w:val="19"/>
         </w:rPr>
-        <w:t>Модуль 4 · неделя 13 · медиа: схема</w:t>
+        <w:t>Модуль 4 · неделя 9, понедельник · медиа: схема</w:t>
       </w:r>
     </w:p>
     <w:p>
@@ -25539,7 +26517,7 @@
                 <w:color w:val="1F1D1A"/>
                 <w:sz w:val="22"/>
               </w:rPr>
-              <w:t>Урок 25. Память проекта: файл CLAUDE.md</w:t>
+              <w:t>Память проекта: файл CLAUDE.md</w:t>
             </w:r>
           </w:p>
           <w:p>
@@ -25880,22 +26858,6 @@
       </w:r>
     </w:p>
     <w:p>
-      <w:pPr>
-        <w:spacing w:after="120" w:before="0" w:line="276" w:lineRule="auto"/>
-        <w:jc w:val="center"/>
-      </w:pPr>
-      <w:r>
-        <w:rPr>
-          <w:rFonts w:ascii="Calibri" w:hAnsi="Calibri"/>
-          <w:b w:val="0"/>
-          <w:i/>
-          <w:color w:val="6B665E"/>
-          <w:sz w:val="18"/>
-        </w:rPr>
-        <w:t>Схема к посту 25 (файл d25_claude_md.png)</w:t>
-      </w:r>
-    </w:p>
-    <w:p>
       <w:r>
         <w:br w:type="page"/>
       </w:r>
@@ -25943,7 +26905,7 @@
           <w:color w:val="6B665E"/>
           <w:sz w:val="19"/>
         </w:rPr>
-        <w:t>Модуль 5 · неделя 13 · медиа: видео</w:t>
+        <w:t>Модуль 5 · неделя 9, среда · медиа: видео</w:t>
       </w:r>
     </w:p>
     <w:p>
@@ -26029,7 +26991,7 @@
                 <w:color w:val="1F1D1A"/>
                 <w:sz w:val="22"/>
               </w:rPr>
-              <w:t>Урок 26. Навыки: упаковываем повторяющиеся задачи</w:t>
+              <w:t>Навыки: упаковываем повторяющиеся задачи</w:t>
             </w:r>
           </w:p>
           <w:p>
@@ -27318,7 +28280,7 @@
           <w:color w:val="6B665E"/>
           <w:sz w:val="19"/>
         </w:rPr>
-        <w:t>Модуль 5 · неделя 14 · медиа: схема, скриншот</w:t>
+        <w:t>Модуль 5 · неделя 9, пятница · медиа: схема, скриншот</w:t>
       </w:r>
     </w:p>
     <w:p>
@@ -27404,7 +28366,7 @@
                 <w:color w:val="1F1D1A"/>
                 <w:sz w:val="22"/>
               </w:rPr>
-              <w:t>Урок 27. Подключения к сервисам</w:t>
+              <w:t>Подключения к сервисам</w:t>
             </w:r>
           </w:p>
           <w:p>
@@ -27713,22 +28675,6 @@
     </w:p>
     <w:p>
       <w:pPr>
-        <w:spacing w:after="120" w:before="0" w:line="276" w:lineRule="auto"/>
-        <w:jc w:val="center"/>
-      </w:pPr>
-      <w:r>
-        <w:rPr>
-          <w:rFonts w:ascii="Calibri" w:hAnsi="Calibri"/>
-          <w:b w:val="0"/>
-          <w:i/>
-          <w:color w:val="6B665E"/>
-          <w:sz w:val="18"/>
-        </w:rPr>
-        <w:t>Схема к посту 27 (файл d27_connectors.png)</w:t>
-      </w:r>
-    </w:p>
-    <w:p>
-      <w:pPr>
         <w:keepNext/>
         <w:spacing w:after="60" w:before="200" w:line="276" w:lineRule="auto"/>
       </w:pPr>
@@ -27783,7 +28729,7 @@
           <w:color w:val="6B665E"/>
           <w:sz w:val="19"/>
         </w:rPr>
-        <w:t>Модуль 5 · неделя 14 · медиа: скриншот</w:t>
+        <w:t>Модуль 5 · неделя 10, понедельник · медиа: скриншот</w:t>
       </w:r>
     </w:p>
     <w:p>
@@ -27869,7 +28815,7 @@
                 <w:color w:val="1F1D1A"/>
                 <w:sz w:val="22"/>
               </w:rPr>
-              <w:t>Урок 28. Задачи по расписанию</w:t>
+              <w:t>Задачи по расписанию</w:t>
             </w:r>
           </w:p>
           <w:p>
@@ -28216,7 +29162,7 @@
           <w:color w:val="6B665E"/>
           <w:sz w:val="19"/>
         </w:rPr>
-        <w:t>Модуль 6 · неделя 15 · медиа: схема</w:t>
+        <w:t>Модуль 6 · неделя 10, среда · медиа: схема</w:t>
       </w:r>
     </w:p>
     <w:p>
@@ -28302,7 +29248,7 @@
                 <w:color w:val="1F1D1A"/>
                 <w:sz w:val="22"/>
               </w:rPr>
-              <w:t>Урок 29. Что такое агент и субагент</w:t>
+              <w:t>Что такое агент и субагент</w:t>
             </w:r>
           </w:p>
           <w:p>
@@ -28578,22 +29524,6 @@
       </w:r>
     </w:p>
     <w:p>
-      <w:pPr>
-        <w:spacing w:after="120" w:before="0" w:line="276" w:lineRule="auto"/>
-        <w:jc w:val="center"/>
-      </w:pPr>
-      <w:r>
-        <w:rPr>
-          <w:rFonts w:ascii="Calibri" w:hAnsi="Calibri"/>
-          <w:b w:val="0"/>
-          <w:i/>
-          <w:color w:val="6B665E"/>
-          <w:sz w:val="18"/>
-        </w:rPr>
-        <w:t>Схема к посту 29 (файл d29_agent.png)</w:t>
-      </w:r>
-    </w:p>
-    <w:p>
       <w:r>
         <w:br w:type="page"/>
       </w:r>
@@ -28618,7 +29548,7 @@
           <w:color w:val="6B665E"/>
           <w:sz w:val="19"/>
         </w:rPr>
-        <w:t>Модуль 6 · неделя 15 · медиа: схема</w:t>
+        <w:t>Модуль 6 · неделя 10, пятница · медиа: схема</w:t>
       </w:r>
     </w:p>
     <w:p>
@@ -28704,7 +29634,7 @@
                 <w:color w:val="1F1D1A"/>
                 <w:sz w:val="22"/>
               </w:rPr>
-              <w:t>Урок 30. Команда агентов: тимлид и специалисты</w:t>
+              <w:t>Команда агентов: тимлид и специалисты</w:t>
             </w:r>
           </w:p>
           <w:p>
@@ -29046,22 +29976,6 @@
     </w:p>
     <w:p>
       <w:pPr>
-        <w:spacing w:after="120" w:before="0" w:line="276" w:lineRule="auto"/>
-        <w:jc w:val="center"/>
-      </w:pPr>
-      <w:r>
-        <w:rPr>
-          <w:rFonts w:ascii="Calibri" w:hAnsi="Calibri"/>
-          <w:b w:val="0"/>
-          <w:i/>
-          <w:color w:val="6B665E"/>
-          <w:sz w:val="18"/>
-        </w:rPr>
-        <w:t>Схема к посту 30 (файл d30_team.png)</w:t>
-      </w:r>
-    </w:p>
-    <w:p>
-      <w:pPr>
         <w:keepNext/>
         <w:spacing w:after="60" w:before="200" w:line="276" w:lineRule="auto"/>
       </w:pPr>
@@ -29116,7 +30030,7 @@
           <w:color w:val="6B665E"/>
           <w:sz w:val="19"/>
         </w:rPr>
-        <w:t>Модуль 6 · неделя 16 · медиа: схема</w:t>
+        <w:t>Модуль 6 · неделя 11, понедельник · медиа: схема</w:t>
       </w:r>
     </w:p>
     <w:p>
@@ -29202,7 +30116,7 @@
                 <w:color w:val="1F1D1A"/>
                 <w:sz w:val="22"/>
               </w:rPr>
-              <w:t>Урок 31. Контроль качества на «заводе»</w:t>
+              <w:t>Контроль качества на «заводе»</w:t>
             </w:r>
           </w:p>
           <w:p>
@@ -29433,22 +30347,6 @@
       </w:r>
     </w:p>
     <w:p>
-      <w:pPr>
-        <w:spacing w:after="120" w:before="0" w:line="276" w:lineRule="auto"/>
-        <w:jc w:val="center"/>
-      </w:pPr>
-      <w:r>
-        <w:rPr>
-          <w:rFonts w:ascii="Calibri" w:hAnsi="Calibri"/>
-          <w:b w:val="0"/>
-          <w:i/>
-          <w:color w:val="6B665E"/>
-          <w:sz w:val="18"/>
-        </w:rPr>
-        <w:t>Схема к посту 31 (файл d31_pipeline.png)</w:t>
-      </w:r>
-    </w:p>
-    <w:p>
       <w:r>
         <w:br w:type="page"/>
       </w:r>
@@ -29473,7 +30371,7 @@
           <w:color w:val="6B665E"/>
           <w:sz w:val="19"/>
         </w:rPr>
-        <w:t>Модуль 6 · неделя 16 · медиа: видео</w:t>
+        <w:t>Модуль 6 · неделя 11, среда · медиа: видео</w:t>
       </w:r>
     </w:p>
     <w:p>
@@ -29559,7 +30457,7 @@
                 <w:color w:val="1F1D1A"/>
                 <w:sz w:val="22"/>
               </w:rPr>
-              <w:t>Урок 32. Живой кейс: от ТЗ до комплекта документов</w:t>
+              <w:t>Живой кейс: от ТЗ до комплекта документов</w:t>
             </w:r>
           </w:p>
           <w:p>

</xml_diff>

<commit_message>
Posts: replace «урок» wording with «пост»
Co-Authored-By: Claude Opus 5.5 <noreply@anthropic.com>
Claude-Session: https://claude.ai/code/session_01FgjxzsDdzzGnQ6pRqhP9ux
</commit_message>
<xml_diff>
--- a/Посты_для_канала_32.docx
+++ b/Посты_для_канала_32.docx
@@ -6626,7 +6626,7 @@
                 <w:color w:val="1F1D1A"/>
                 <w:sz w:val="22"/>
               </w:rPr>
-              <w:t>Коллеги, начинаем серию коротких уроков по работе с ИИ. Три раза в неделю — одна тема, без лишней теории.</w:t>
+              <w:t>Коллеги, запускаю серию коротких, но содержательных постов о работе с ИИ — от самых основ до продвинутых приёмов. Три раза в неделю, в понедельник, среду и пятницу, — одна тема с примерами из нашей работы и без лишней теории.</w:t>
             </w:r>
           </w:p>
           <w:p>
@@ -11167,7 +11167,7 @@
                 <w:color w:val="1F1D1A"/>
                 <w:sz w:val="22"/>
               </w:rPr>
-              <w:t>В видео к уроку показываю оба приёма на реальной задаче.</w:t>
+              <w:t>В видео к посту показываю оба приёма на реальной задаче.</w:t>
             </w:r>
           </w:p>
           <w:p>
@@ -13745,7 +13745,7 @@
                 <w:color w:val="1F1D1A"/>
                 <w:sz w:val="22"/>
               </w:rPr>
-              <w:t>И небольшой опрос ниже: какие задачи вы уже решаете с помощью Claude? Это поможет мне подбирать примеры для следующих уроков.</w:t>
+              <w:t>И небольшой опрос ниже: какие задачи вы уже решаете с помощью Claude? Это поможет мне подбирать примеры для следующих постов.</w:t>
             </w:r>
           </w:p>
         </w:tc>
@@ -18856,7 +18856,7 @@
                 <w:color w:val="1F1D1A"/>
                 <w:sz w:val="22"/>
               </w:rPr>
-              <w:t>Прошу для рабочих задач использовать Code. Как его запустить — в следующем уроке.</w:t>
+              <w:t>Прошу для рабочих задач использовать Code. Как его запустить — в следующем посте.</w:t>
             </w:r>
           </w:p>
         </w:tc>
@@ -29433,7 +29433,7 @@
                 <w:color w:val="1F1D1A"/>
                 <w:sz w:val="22"/>
               </w:rPr>
-              <w:t>В следующем уроке соберём из агентов команду.</w:t>
+              <w:t>В следующем посте соберём из агентов команду.</w:t>
             </w:r>
           </w:p>
         </w:tc>
@@ -30477,7 +30477,7 @@
                 <w:color w:val="1F1D1A"/>
                 <w:sz w:val="22"/>
               </w:rPr>
-              <w:t>Финальный урок курса — без теории. Показываю на одной задаче всё, что мы прошли.</w:t>
+              <w:t>Финальный пост серии — без теории. Показываю на одной задаче всё, что мы прошли.</w:t>
             </w:r>
           </w:p>
           <w:p>
@@ -30627,7 +30627,7 @@
                 <w:color w:val="1F1D1A"/>
                 <w:sz w:val="22"/>
               </w:rPr>
-              <w:t>Главные выводы курса:</w:t>
+              <w:t>Главные выводы:</w:t>
             </w:r>
           </w:p>
           <w:p>
@@ -30722,7 +30722,7 @@
                 <w:color w:val="1F1D1A"/>
                 <w:sz w:val="22"/>
               </w:rPr>
-              <w:t>Спасибо всем, кто прошёл курс. Канал продолжает работать: вопросы, удачные промты и новые возможности — здесь.</w:t>
+              <w:t>Спасибо всем, кто прошёл этот путь вместе со мной. Канал продолжает работать: вопросы, удачные промты и новые возможности — здесь.</w:t>
             </w:r>
           </w:p>
         </w:tc>
@@ -32086,7 +32086,7 @@
                 <w:color w:val="1F1D1A"/>
                 <w:sz w:val="19"/>
               </w:rPr>
-              <w:t>Итоги курса и что дальше.</w:t>
+              <w:t>Главные выводы и что дальше.</w:t>
             </w:r>
           </w:p>
         </w:tc>

</xml_diff>

<commit_message>
First post: announce the series from basics to agent teams
Co-Authored-By: Claude Opus 5.5 <noreply@anthropic.com>
Claude-Session: https://claude.ai/code/session_01FgjxzsDdzzGnQ6pRqhP9ux
</commit_message>
<xml_diff>
--- a/Посты_для_канала_32.docx
+++ b/Посты_для_канала_32.docx
@@ -159,7 +159,7 @@
           <w:color w:val="6B665E"/>
           <w:sz w:val="20"/>
         </w:rPr>
-        <w:t>Версия от 10.10.2026</w:t>
+        <w:t>Версия от 11.10.2026</w:t>
       </w:r>
     </w:p>
     <w:p>
@@ -6626,7 +6626,27 @@
                 <w:color w:val="1F1D1A"/>
                 <w:sz w:val="22"/>
               </w:rPr>
-              <w:t>Коллеги, запускаю серию коротких, но содержательных постов о работе с ИИ — от самых основ до продвинутых приёмов. Три раза в неделю, в понедельник, среду и пятницу, — одна тема с примерами из нашей работы и без лишней теории.</w:t>
+              <w:t>Коллеги, запускаю серию коротких, но содержательных постов о работе с ИИ. Пройдём весь путь: от того, что такое Claude и как правильно ставить ему задачи, до того, как построить свой «Claude-завод» — команду ИИ-агентов, которая под вашим руководством решает сложные проектные задачи.</w:t>
+            </w:r>
+          </w:p>
+          <w:p>
+            <w:pPr>
+              <w:spacing w:after="40" w:line="276" w:lineRule="auto"/>
+            </w:pPr>
+          </w:p>
+          <w:p>
+            <w:pPr>
+              <w:spacing w:after="0" w:line="276" w:lineRule="auto"/>
+            </w:pPr>
+            <w:r>
+              <w:rPr>
+                <w:rFonts w:ascii="Calibri" w:hAnsi="Calibri"/>
+                <w:b w:val="0"/>
+                <w:i w:val="0"/>
+                <w:color w:val="1F1D1A"/>
+                <w:sz w:val="22"/>
+              </w:rPr>
+              <w:t>Три раза в неделю, в понедельник, среду и пятницу, — одна тема с примерами из нашей работы и без лишней теории. Начнём с основ.</w:t>
             </w:r>
           </w:p>
           <w:p>

</xml_diff>

<commit_message>
First post: note on Claude access rollout
Co-Authored-By: Claude Opus 5.5 <noreply@anthropic.com>
Claude-Session: https://claude.ai/code/session_01FgjxzsDdzzGnQ6pRqhP9ux
</commit_message>
<xml_diff>
--- a/Посты_для_канала_32.docx
+++ b/Посты_для_канала_32.docx
@@ -159,7 +159,7 @@
           <w:color w:val="6B665E"/>
           <w:sz w:val="20"/>
         </w:rPr>
-        <w:t>Версия от 11.10.2026</w:t>
+        <w:t>Версия от 12.10.2026</w:t>
       </w:r>
     </w:p>
     <w:p>
@@ -6646,7 +6646,47 @@
                 <w:color w:val="1F1D1A"/>
                 <w:sz w:val="22"/>
               </w:rPr>
-              <w:t>Три раза в неделю, в понедельник, среду и пятницу, — одна тема с примерами из нашей работы и без лишней теории. Начнём с основ.</w:t>
+              <w:t>Три раза в неделю, в понедельник, среду и пятницу, — одна тема с примерами из нашей работы и без лишней теории.</w:t>
+            </w:r>
+          </w:p>
+          <w:p>
+            <w:pPr>
+              <w:spacing w:after="40" w:line="276" w:lineRule="auto"/>
+            </w:pPr>
+          </w:p>
+          <w:p>
+            <w:pPr>
+              <w:spacing w:after="0" w:line="276" w:lineRule="auto"/>
+            </w:pPr>
+            <w:r>
+              <w:rPr>
+                <w:rFonts w:ascii="Calibri" w:hAnsi="Calibri"/>
+                <w:b w:val="0"/>
+                <w:i w:val="0"/>
+                <w:color w:val="1F1D1A"/>
+                <w:sz w:val="22"/>
+              </w:rPr>
+              <w:t>Большинство из вас уже подключены к Claude и могут сразу пробовать всё на практике. Остальных коллег подключу после 19 октября — до этого посты можно читать и сохранять, чтобы потом быстро начать работу.</w:t>
+            </w:r>
+          </w:p>
+          <w:p>
+            <w:pPr>
+              <w:spacing w:after="40" w:line="276" w:lineRule="auto"/>
+            </w:pPr>
+          </w:p>
+          <w:p>
+            <w:pPr>
+              <w:spacing w:after="0" w:line="276" w:lineRule="auto"/>
+            </w:pPr>
+            <w:r>
+              <w:rPr>
+                <w:rFonts w:ascii="Calibri" w:hAnsi="Calibri"/>
+                <w:b w:val="0"/>
+                <w:i w:val="0"/>
+                <w:color w:val="1F1D1A"/>
+                <w:sz w:val="22"/>
+              </w:rPr>
+              <w:t>Начнём с основ.</w:t>
             </w:r>
           </w:p>
           <w:p>

</xml_diff>